<commit_message>
Cambio de plantilla y reconfiguración de frontend.
</commit_message>
<xml_diff>
--- a/backend/plantilla_transporte.docx
+++ b/backend/plantilla_transporte.docx
@@ -1,6 +1,6 @@
 
 <file path=word/document.xml><?xml version="1.0" encoding="utf-8"?>
-<w:document xmlns:wpc="http://schemas.microsoft.com/office/word/2010/wordprocessingCanvas" xmlns:cx="http://schemas.microsoft.com/office/drawing/2014/chartex" xmlns:cx1="http://schemas.microsoft.com/office/drawing/2015/9/8/chartex" xmlns:cx2="http://schemas.microsoft.com/office/drawing/2015/10/21/chartex" xmlns:cx3="http://schemas.microsoft.com/office/drawing/2016/5/9/chartex" xmlns:cx4="http://schemas.microsoft.com/office/drawing/2016/5/10/chartex" xmlns:cx5="http://schemas.microsoft.com/office/drawing/2016/5/11/chartex" xmlns:cx6="http://schemas.microsoft.com/office/drawing/2016/5/12/chartex" xmlns:cx7="http://schemas.microsoft.com/office/drawing/2016/5/13/chartex" xmlns:cx8="http://schemas.microsoft.com/office/drawing/2016/5/14/chartex" xmlns:mc="http://schemas.openxmlformats.org/markup-compatibility/2006" xmlns:aink="http://schemas.microsoft.com/office/drawing/2016/ink" xmlns:am3d="http://schemas.microsoft.com/office/drawing/2017/model3d" xmlns:o="urn:schemas-microsoft-com:office:office" xmlns:oel="http://schemas.microsoft.com/office/2019/extlst" xmlns:r="http://schemas.openxmlformats.org/officeDocument/2006/relationships" xmlns:m="http://schemas.openxmlformats.org/officeDocument/2006/math" xmlns:v="urn:schemas-microsoft-com:vml" xmlns:wp14="http://schemas.microsoft.com/office/word/2010/wordprocessingDrawing" xmlns:wp="http://schemas.openxmlformats.org/drawingml/2006/wordprocessingDrawing" xmlns:w10="urn:schemas-microsoft-com:office:word" xmlns:w="http://schemas.openxmlformats.org/wordprocessingml/2006/main" xmlns:w14="http://schemas.microsoft.com/office/word/2010/wordml" xmlns:w15="http://schemas.microsoft.com/office/word/2012/wordml" xmlns:w16cex="http://schemas.microsoft.com/office/word/2018/wordml/cex" xmlns:w16cid="http://schemas.microsoft.com/office/word/2016/wordml/cid" xmlns:w16="http://schemas.microsoft.com/office/word/2018/wordml" xmlns:w16du="http://schemas.microsoft.com/office/word/2023/wordml/word16du" xmlns:w16sdtdh="http://schemas.microsoft.com/office/word/2020/wordml/sdtdatahash" xmlns:w16sdtfl="http://schemas.microsoft.com/office/word/2024/wordml/sdtformatlock" xmlns:w16se="http://schemas.microsoft.com/office/word/2015/wordml/symex" xmlns:wpg="http://schemas.microsoft.com/office/word/2010/wordprocessingGroup" xmlns:wpi="http://schemas.microsoft.com/office/word/2010/wordprocessingInk" xmlns:wne="http://schemas.microsoft.com/office/word/2006/wordml" xmlns:wps="http://schemas.microsoft.com/office/word/2010/wordprocessingShape" mc:Ignorable="w14 w15 w16se w16cid w16 w16cex w16sdtdh w16sdtfl w16du wp14">
+<w:document xmlns:wpc="http://schemas.microsoft.com/office/word/2010/wordprocessingCanvas" xmlns:cx="http://schemas.microsoft.com/office/drawing/2014/chartex" xmlns:cx1="http://schemas.microsoft.com/office/drawing/2015/9/8/chartex" xmlns:cx2="http://schemas.microsoft.com/office/drawing/2015/10/21/chartex" xmlns:cx3="http://schemas.microsoft.com/office/drawing/2016/5/9/chartex" xmlns:cx4="http://schemas.microsoft.com/office/drawing/2016/5/10/chartex" xmlns:cx5="http://schemas.microsoft.com/office/drawing/2016/5/11/chartex" xmlns:cx6="http://schemas.microsoft.com/office/drawing/2016/5/12/chartex" xmlns:cx7="http://schemas.microsoft.com/office/drawing/2016/5/13/chartex" xmlns:cx8="http://schemas.microsoft.com/office/drawing/2016/5/14/chartex" xmlns:mc="http://schemas.openxmlformats.org/markup-compatibility/2006" xmlns:aink="http://schemas.microsoft.com/office/drawing/2016/ink" xmlns:am3d="http://schemas.microsoft.com/office/drawing/2017/model3d" xmlns:o="urn:schemas-microsoft-com:office:office" xmlns:oel="http://schemas.microsoft.com/office/2019/extlst" xmlns:r="http://schemas.openxmlformats.org/officeDocument/2006/relationships" xmlns:m="http://schemas.openxmlformats.org/officeDocument/2006/math" xmlns:v="urn:schemas-microsoft-com:vml" xmlns:wp14="http://schemas.microsoft.com/office/word/2010/wordprocessingDrawing" xmlns:wp="http://schemas.openxmlformats.org/drawingml/2006/wordprocessingDrawing" xmlns:w10="urn:schemas-microsoft-com:office:word" xmlns:w="http://schemas.openxmlformats.org/wordprocessingml/2006/main" xmlns:w14="http://schemas.microsoft.com/office/word/2010/wordml" xmlns:w15="http://schemas.microsoft.com/office/word/2012/wordml" xmlns:w16cei="http://schemas.microsoft.com/office/word/2026/wordml/cei" xmlns:w16cex="http://schemas.microsoft.com/office/word/2018/wordml/cex" xmlns:w16cid="http://schemas.microsoft.com/office/word/2016/wordml/cid" xmlns:w16="http://schemas.microsoft.com/office/word/2018/wordml" xmlns:w16du="http://schemas.microsoft.com/office/word/2023/wordml/word16du" xmlns:w16sdtdh="http://schemas.microsoft.com/office/word/2020/wordml/sdtdatahash" xmlns:w16sdtfl="http://schemas.microsoft.com/office/word/2024/wordml/sdtformatlock" xmlns:w16se="http://schemas.microsoft.com/office/word/2015/wordml/symex" xmlns:wpg="http://schemas.microsoft.com/office/word/2010/wordprocessingGroup" xmlns:wpi="http://schemas.microsoft.com/office/word/2010/wordprocessingInk" xmlns:wne="http://schemas.microsoft.com/office/word/2006/wordml" xmlns:wps="http://schemas.microsoft.com/office/word/2010/wordprocessingShape" mc:Ignorable="w14 w15 w16se w16cid w16 w16cex w16sdtdh w16sdtfl w16du wp14">
   <w:body>
     <w:p>
       <w:pPr>
@@ -80,7 +80,7 @@
           <w:b/>
           <w:bCs/>
         </w:rPr>
-        <w:t>SOLICITUD Y AUTORIZACIÓN DE MISIÓN OFICIAL</w:t>
+        <w:t>SOLICITUD DE TRANSPORTE PARA MISIÓN OFICIAL</w:t>
       </w:r>
     </w:p>
     <w:p>
@@ -121,27 +121,43 @@
           <w:sz w:val="22"/>
           <w:szCs w:val="22"/>
         </w:rPr>
-        <w:t>{{fecha_actual}}</w:t>
-      </w:r>
-    </w:p>
-    <w:p>
-      <w:pPr>
-        <w:pStyle w:val="Standard"/>
-        <w:tabs>
-          <w:tab w:val="left" w:pos="3375"/>
-          <w:tab w:val="left" w:pos="3525"/>
-        </w:tabs>
-        <w:rPr>
-          <w:sz w:val="22"/>
-          <w:szCs w:val="22"/>
-        </w:rPr>
-      </w:pPr>
-      <w:r>
-        <w:rPr>
-          <w:sz w:val="22"/>
-          <w:szCs w:val="22"/>
-        </w:rPr>
-        <w:t>Señor Jefe de Transporte</w:t>
+        <w:t>{{</w:t>
+      </w:r>
+      <w:proofErr w:type="spellStart"/>
+      <w:r>
+        <w:rPr>
+          <w:sz w:val="22"/>
+          <w:szCs w:val="22"/>
+        </w:rPr>
+        <w:t>fecha_actual</w:t>
+      </w:r>
+      <w:proofErr w:type="spellEnd"/>
+      <w:r>
+        <w:rPr>
+          <w:sz w:val="22"/>
+          <w:szCs w:val="22"/>
+        </w:rPr>
+        <w:t>}}</w:t>
+      </w:r>
+    </w:p>
+    <w:p>
+      <w:pPr>
+        <w:pStyle w:val="Standard"/>
+        <w:tabs>
+          <w:tab w:val="left" w:pos="3375"/>
+          <w:tab w:val="left" w:pos="3525"/>
+        </w:tabs>
+        <w:rPr>
+          <w:sz w:val="22"/>
+          <w:szCs w:val="22"/>
+        </w:rPr>
+      </w:pPr>
+      <w:r>
+        <w:rPr>
+          <w:sz w:val="22"/>
+          <w:szCs w:val="22"/>
+        </w:rPr>
+        <w:t xml:space="preserve">Encargado de Combustible </w:t>
       </w:r>
     </w:p>
     <w:p>
@@ -222,7 +238,31 @@
           <w:sz w:val="22"/>
           <w:szCs w:val="22"/>
         </w:rPr>
-        <w:t>, de la Gerencia de Provisión de Recursos Tecnológicos, solicito a usted otorgar servicio de transporte para:</w:t>
+        <w:t xml:space="preserve">, </w:t>
+      </w:r>
+      <w:r>
+        <w:rPr>
+          <w:sz w:val="22"/>
+          <w:szCs w:val="22"/>
+        </w:rPr>
+        <w:t>de la Dirección de Administración y Gestión Territorial</w:t>
+      </w:r>
+      <w:r>
+        <w:rPr>
+          <w:sz w:val="22"/>
+          <w:szCs w:val="22"/>
+        </w:rPr>
+        <w:t>,</w:t>
+      </w:r>
+      <w:r>
+        <w:rPr>
+          <w:sz w:val="22"/>
+          <w:szCs w:val="22"/>
+        </w:rPr>
+        <w:t xml:space="preserve"> Solicito se otorgue servicio de transporte para:</w:t>
+      </w:r>
+      <w:r>
+        <w:t xml:space="preserve"> </w:t>
       </w:r>
       <w:r>
         <w:rPr>
@@ -231,9 +271,8 @@
           <w:sz w:val="22"/>
           <w:szCs w:val="22"/>
         </w:rPr>
-        <w:t xml:space="preserve"> </w:t>
-      </w:r>
-      <w:bookmarkStart w:id="0" w:name="_Hlk136950010"/>
+        <w:t>{{nombres}}</w:t>
+      </w:r>
       <w:r>
         <w:rPr>
           <w:b/>
@@ -241,25 +280,41 @@
           <w:sz w:val="22"/>
           <w:szCs w:val="22"/>
         </w:rPr>
-        <w:t>{{nombres}}</w:t>
-      </w:r>
-      <w:r>
-        <w:rPr>
-          <w:sz w:val="22"/>
-          <w:szCs w:val="22"/>
-        </w:rPr>
-        <w:t xml:space="preserve">, a efecto de dar cumplimiento a misión oficial, según detallo a continuación. </w:t>
+        <w:t xml:space="preserve"> </w:t>
+      </w:r>
+      <w:bookmarkStart w:id="0" w:name="_Hlk136950010"/>
+      <w:r>
+        <w:rPr>
+          <w:sz w:val="22"/>
+          <w:szCs w:val="22"/>
+        </w:rPr>
+        <w:t>a efecto de dar cumplimiento a misión oficial, según detallo a continuación</w:t>
+      </w:r>
+      <w:r>
+        <w:rPr>
+          <w:sz w:val="22"/>
+          <w:szCs w:val="22"/>
+        </w:rPr>
+        <w:t>:</w:t>
+      </w:r>
+      <w:r>
+        <w:rPr>
+          <w:sz w:val="22"/>
+          <w:szCs w:val="22"/>
+        </w:rPr>
+        <w:t xml:space="preserve"> </w:t>
       </w:r>
     </w:p>
     <w:tbl>
       <w:tblPr>
         <w:tblStyle w:val="Tablaconcuadrcula"/>
-        <w:tblpPr w:leftFromText="141" w:rightFromText="141" w:vertAnchor="text" w:horzAnchor="page" w:tblpX="1381" w:tblpY="193"/>
-        <w:tblW w:w="0" w:type="auto"/>
+        <w:tblpPr w:leftFromText="141" w:rightFromText="141" w:vertAnchor="text" w:horzAnchor="page" w:tblpX="521" w:tblpY="193"/>
+        <w:tblW w:w="10490" w:type="dxa"/>
         <w:tblLook w:val="04A0" w:firstRow="1" w:lastRow="0" w:firstColumn="1" w:lastColumn="0" w:noHBand="0" w:noVBand="1"/>
       </w:tblPr>
       <w:tblGrid>
-        <w:gridCol w:w="1934"/>
+        <w:gridCol w:w="1129"/>
+        <w:gridCol w:w="9361"/>
       </w:tblGrid>
       <w:tr>
         <w:trPr>
@@ -267,10 +322,48 @@
         </w:trPr>
         <w:tc>
           <w:tcPr>
-            <w:tcW w:w="0" w:type="auto"/>
+            <w:tcW w:w="1129" w:type="dxa"/>
+            <w:tcBorders>
+              <w:top w:val="nil"/>
+              <w:left w:val="nil"/>
+              <w:bottom w:val="nil"/>
+              <w:right w:val="single" w:sz="4" w:space="0" w:color="auto"/>
+            </w:tcBorders>
+          </w:tcPr>
+          <w:bookmarkEnd w:id="0"/>
+          <w:p>
+            <w:pPr>
+              <w:pStyle w:val="Standard"/>
+              <w:tabs>
+                <w:tab w:val="left" w:pos="3375"/>
+                <w:tab w:val="left" w:pos="3525"/>
+              </w:tabs>
+            </w:pPr>
+            <w:r>
+              <w:rPr>
+                <w:b/>
+                <w:sz w:val="22"/>
+                <w:szCs w:val="22"/>
+              </w:rPr>
+              <w:t>Misión</w:t>
+            </w:r>
+            <w:r>
+              <w:rPr>
+                <w:sz w:val="22"/>
+                <w:szCs w:val="22"/>
+              </w:rPr>
+              <w:t xml:space="preserve">:        </w:t>
+            </w:r>
+          </w:p>
+        </w:tc>
+        <w:tc>
+          <w:tcPr>
+            <w:tcW w:w="9361" w:type="dxa"/>
+            <w:tcBorders>
+              <w:left w:val="single" w:sz="4" w:space="0" w:color="auto"/>
+            </w:tcBorders>
             <w:vAlign w:val="center"/>
           </w:tcPr>
-          <w:bookmarkEnd w:id="0"/>
           <w:p>
             <w:pPr>
               <w:pStyle w:val="Standard"/>
@@ -285,7 +378,23 @@
                 <w:sz w:val="22"/>
                 <w:szCs w:val="22"/>
               </w:rPr>
-              <w:t>{{detalle_mision}}</w:t>
+              <w:t>{{</w:t>
+            </w:r>
+            <w:proofErr w:type="spellStart"/>
+            <w:r>
+              <w:rPr>
+                <w:sz w:val="22"/>
+                <w:szCs w:val="22"/>
+              </w:rPr>
+              <w:t>detalle_mision</w:t>
+            </w:r>
+            <w:proofErr w:type="spellEnd"/>
+            <w:r>
+              <w:rPr>
+                <w:sz w:val="22"/>
+                <w:szCs w:val="22"/>
+              </w:rPr>
+              <w:t>}}</w:t>
             </w:r>
           </w:p>
         </w:tc>
@@ -312,29 +421,18 @@
           <w:tab w:val="left" w:pos="3525"/>
         </w:tabs>
       </w:pPr>
-      <w:r>
-        <w:rPr>
-          <w:b/>
-          <w:sz w:val="22"/>
-          <w:szCs w:val="22"/>
-        </w:rPr>
-        <w:t>Misión</w:t>
-      </w:r>
-      <w:r>
-        <w:rPr>
-          <w:sz w:val="22"/>
-          <w:szCs w:val="22"/>
-        </w:rPr>
-        <w:t xml:space="preserve">: </w:t>
-      </w:r>
-    </w:p>
-    <w:p>
-      <w:pPr>
-        <w:pStyle w:val="Standard"/>
-        <w:tabs>
-          <w:tab w:val="left" w:pos="3375"/>
-          <w:tab w:val="left" w:pos="3525"/>
-        </w:tabs>
+    </w:p>
+    <w:p>
+      <w:pPr>
+        <w:pStyle w:val="Standard"/>
+        <w:tabs>
+          <w:tab w:val="left" w:pos="3375"/>
+          <w:tab w:val="left" w:pos="3525"/>
+        </w:tabs>
+        <w:rPr>
+          <w:sz w:val="22"/>
+          <w:szCs w:val="22"/>
+        </w:rPr>
       </w:pPr>
     </w:p>
     <w:p>
@@ -367,7 +465,10 @@
       </w:tblPr>
       <w:tblGrid>
         <w:gridCol w:w="1361"/>
-        <w:gridCol w:w="1256"/>
+        <w:gridCol w:w="2028"/>
+        <w:gridCol w:w="3791"/>
+        <w:gridCol w:w="1548"/>
+        <w:gridCol w:w="2629"/>
       </w:tblGrid>
       <w:tr>
         <w:trPr>
@@ -407,7 +508,6 @@
             <w:tcW w:w="0" w:type="auto"/>
             <w:tcBorders>
               <w:top w:val="single" w:sz="4" w:space="0" w:color="auto"/>
-              <w:left w:val="single" w:sz="4" w:space="0" w:color="auto"/>
               <w:bottom w:val="single" w:sz="4" w:space="0" w:color="auto"/>
               <w:right w:val="single" w:sz="4" w:space="0" w:color="auto"/>
             </w:tcBorders>
@@ -419,17 +519,340 @@
                 <w:tab w:val="left" w:pos="3375"/>
                 <w:tab w:val="left" w:pos="3525"/>
               </w:tabs>
+              <w:ind w:left="38"/>
               <w:rPr>
+                <w:b/>
+                <w:bCs/>
+              </w:rPr>
+            </w:pPr>
+            <w:r>
+              <w:rPr>
+                <w:rFonts w:ascii="Bodoni" w:eastAsia="Bodoni" w:hAnsi="Bodoni" w:cs="Bodoni"/>
+                <w:b/>
+                <w:bCs/>
+                <w:i/>
+                <w:iCs/>
+                <w:sz w:val="20"/>
+                <w:szCs w:val="20"/>
+              </w:rPr>
+              <w:t>CÓDIGO</w:t>
+            </w:r>
+          </w:p>
+        </w:tc>
+        <w:tc>
+          <w:tcPr>
+            <w:tcW w:w="5081" w:type="dxa"/>
+            <w:tcBorders>
+              <w:top w:val="single" w:sz="4" w:space="0" w:color="auto"/>
+              <w:bottom w:val="single" w:sz="4" w:space="0" w:color="auto"/>
+              <w:right w:val="single" w:sz="4" w:space="0" w:color="auto"/>
+            </w:tcBorders>
+          </w:tcPr>
+          <w:p>
+            <w:pPr>
+              <w:pStyle w:val="Standard"/>
+              <w:tabs>
+                <w:tab w:val="left" w:pos="3375"/>
+                <w:tab w:val="left" w:pos="3525"/>
+              </w:tabs>
+              <w:ind w:left="38"/>
+              <w:rPr>
+                <w:b/>
+                <w:bCs/>
+              </w:rPr>
+            </w:pPr>
+            <w:r>
+              <w:rPr>
+                <w:rFonts w:ascii="Bodoni" w:eastAsia="Bodoni" w:hAnsi="Bodoni" w:cs="Bodoni"/>
+                <w:b/>
+                <w:bCs/>
+                <w:i/>
+                <w:iCs/>
+                <w:sz w:val="20"/>
+                <w:szCs w:val="20"/>
+              </w:rPr>
+              <w:t>INSTITUCIÓN</w:t>
+            </w:r>
+          </w:p>
+        </w:tc>
+        <w:tc>
+          <w:tcPr>
+            <w:tcW w:w="1701" w:type="dxa"/>
+            <w:tcBorders>
+              <w:top w:val="single" w:sz="4" w:space="0" w:color="auto"/>
+              <w:bottom w:val="single" w:sz="4" w:space="0" w:color="auto"/>
+              <w:right w:val="single" w:sz="4" w:space="0" w:color="auto"/>
+            </w:tcBorders>
+          </w:tcPr>
+          <w:p>
+            <w:pPr>
+              <w:pStyle w:val="Standard"/>
+              <w:tabs>
+                <w:tab w:val="left" w:pos="3375"/>
+                <w:tab w:val="left" w:pos="3525"/>
+              </w:tabs>
+              <w:ind w:left="38"/>
+              <w:rPr>
+                <w:b/>
+                <w:bCs/>
+              </w:rPr>
+            </w:pPr>
+            <w:r>
+              <w:rPr>
+                <w:rFonts w:ascii="Bodoni" w:eastAsia="Bodoni" w:hAnsi="Bodoni" w:cs="Bodoni"/>
+                <w:b/>
+                <w:bCs/>
+                <w:i/>
+                <w:iCs/>
+                <w:sz w:val="20"/>
+                <w:szCs w:val="20"/>
+              </w:rPr>
+              <w:t>MUNICIPIO</w:t>
+            </w:r>
+          </w:p>
+        </w:tc>
+        <w:tc>
+          <w:tcPr>
+            <w:tcW w:w="1559" w:type="dxa"/>
+            <w:tcBorders>
+              <w:top w:val="single" w:sz="4" w:space="0" w:color="auto"/>
+              <w:bottom w:val="single" w:sz="4" w:space="0" w:color="auto"/>
+              <w:right w:val="single" w:sz="4" w:space="0" w:color="auto"/>
+            </w:tcBorders>
+          </w:tcPr>
+          <w:p>
+            <w:pPr>
+              <w:pStyle w:val="Standard"/>
+              <w:tabs>
+                <w:tab w:val="left" w:pos="3375"/>
+                <w:tab w:val="left" w:pos="3525"/>
+              </w:tabs>
+              <w:ind w:left="38"/>
+              <w:rPr>
+                <w:b/>
+                <w:bCs/>
+              </w:rPr>
+            </w:pPr>
+            <w:r>
+              <w:rPr>
+                <w:rFonts w:ascii="Bodoni" w:eastAsia="Bodoni" w:hAnsi="Bodoni" w:cs="Bodoni"/>
+                <w:b/>
+                <w:bCs/>
+                <w:i/>
+                <w:iCs/>
+                <w:sz w:val="20"/>
+                <w:szCs w:val="20"/>
+              </w:rPr>
+              <w:t>DEPTO.</w:t>
+            </w:r>
+          </w:p>
+        </w:tc>
+      </w:tr>
+      <w:tr>
+        <w:trPr>
+          <w:cantSplit/>
+        </w:trPr>
+        <w:tc>
+          <w:tcPr>
+            <w:tcW w:w="0" w:type="auto"/>
+            <w:tcBorders>
+              <w:right w:val="single" w:sz="4" w:space="0" w:color="auto"/>
+            </w:tcBorders>
+          </w:tcPr>
+          <w:p>
+            <w:pPr>
+              <w:pStyle w:val="Standard"/>
+              <w:tabs>
+                <w:tab w:val="left" w:pos="3375"/>
+                <w:tab w:val="left" w:pos="3525"/>
+              </w:tabs>
+              <w:ind w:left="38"/>
+              <w:rPr>
+                <w:b/>
+                <w:bCs/>
+              </w:rPr>
+            </w:pPr>
+          </w:p>
+        </w:tc>
+        <w:tc>
+          <w:tcPr>
+            <w:tcW w:w="0" w:type="auto"/>
+            <w:tcBorders>
+              <w:top w:val="single" w:sz="4" w:space="0" w:color="auto"/>
+              <w:bottom w:val="single" w:sz="4" w:space="0" w:color="auto"/>
+              <w:right w:val="single" w:sz="4" w:space="0" w:color="auto"/>
+            </w:tcBorders>
+            <w:vAlign w:val="center"/>
+          </w:tcPr>
+          <w:p>
+            <w:pPr>
+              <w:jc w:val="center"/>
+              <w:rPr>
+                <w:rFonts w:ascii="Bodoni" w:eastAsia="Bodoni" w:hAnsi="Bodoni" w:cs="Bodoni"/>
+                <w:b/>
+                <w:bCs/>
+                <w:i/>
+                <w:iCs/>
                 <w:sz w:val="20"/>
                 <w:szCs w:val="20"/>
               </w:rPr>
             </w:pPr>
             <w:r>
               <w:rPr>
+                <w:rFonts w:ascii="Bodoni" w:eastAsia="Bodoni" w:hAnsi="Bodoni" w:cs="Bodoni"/>
+                <w:i/>
+                <w:iCs/>
                 <w:sz w:val="20"/>
                 <w:szCs w:val="20"/>
               </w:rPr>
-              <w:t>{{destinos}}</w:t>
+              <w:t>{{#destinos</w:t>
+            </w:r>
+            <w:proofErr w:type="gramStart"/>
+            <w:r>
+              <w:rPr>
+                <w:rFonts w:ascii="Bodoni" w:eastAsia="Bodoni" w:hAnsi="Bodoni" w:cs="Bodoni"/>
+                <w:i/>
+                <w:iCs/>
+                <w:sz w:val="20"/>
+                <w:szCs w:val="20"/>
+              </w:rPr>
+              <w:t>}}{</w:t>
+            </w:r>
+            <w:proofErr w:type="gramEnd"/>
+            <w:r>
+              <w:rPr>
+                <w:rFonts w:ascii="Bodoni" w:eastAsia="Bodoni" w:hAnsi="Bodoni" w:cs="Bodoni"/>
+                <w:i/>
+                <w:iCs/>
+                <w:sz w:val="20"/>
+                <w:szCs w:val="20"/>
+              </w:rPr>
+              <w:t>{codigo}}</w:t>
+            </w:r>
+          </w:p>
+        </w:tc>
+        <w:tc>
+          <w:tcPr>
+            <w:tcW w:w="5081" w:type="dxa"/>
+            <w:tcBorders>
+              <w:top w:val="single" w:sz="4" w:space="0" w:color="auto"/>
+              <w:bottom w:val="single" w:sz="4" w:space="0" w:color="auto"/>
+              <w:right w:val="single" w:sz="4" w:space="0" w:color="auto"/>
+            </w:tcBorders>
+          </w:tcPr>
+          <w:p>
+            <w:pPr>
+              <w:rPr>
+                <w:rFonts w:ascii="Bodoni" w:eastAsia="Bodoni" w:hAnsi="Bodoni" w:cs="Bodoni"/>
+                <w:b/>
+                <w:bCs/>
+                <w:i/>
+                <w:iCs/>
+                <w:sz w:val="20"/>
+                <w:szCs w:val="20"/>
+              </w:rPr>
+            </w:pPr>
+            <w:r>
+              <w:rPr>
+                <w:rFonts w:ascii="Bodoni" w:eastAsia="Bodoni" w:hAnsi="Bodoni" w:cs="Bodoni"/>
+                <w:i/>
+                <w:iCs/>
+                <w:sz w:val="20"/>
+                <w:szCs w:val="20"/>
+              </w:rPr>
+              <w:t>{{</w:t>
+            </w:r>
+            <w:proofErr w:type="spellStart"/>
+            <w:r>
+              <w:rPr>
+                <w:rFonts w:ascii="Bodoni" w:eastAsia="Bodoni" w:hAnsi="Bodoni" w:cs="Bodoni"/>
+                <w:i/>
+                <w:iCs/>
+                <w:sz w:val="20"/>
+                <w:szCs w:val="20"/>
+              </w:rPr>
+              <w:t>institucion</w:t>
+            </w:r>
+            <w:proofErr w:type="spellEnd"/>
+            <w:r>
+              <w:rPr>
+                <w:rFonts w:ascii="Bodoni" w:eastAsia="Bodoni" w:hAnsi="Bodoni" w:cs="Bodoni"/>
+                <w:i/>
+                <w:iCs/>
+                <w:sz w:val="20"/>
+                <w:szCs w:val="20"/>
+              </w:rPr>
+              <w:t>}}</w:t>
+            </w:r>
+          </w:p>
+        </w:tc>
+        <w:tc>
+          <w:tcPr>
+            <w:tcW w:w="1701" w:type="dxa"/>
+            <w:tcBorders>
+              <w:top w:val="single" w:sz="4" w:space="0" w:color="auto"/>
+              <w:bottom w:val="single" w:sz="4" w:space="0" w:color="auto"/>
+              <w:right w:val="single" w:sz="4" w:space="0" w:color="auto"/>
+            </w:tcBorders>
+            <w:vAlign w:val="center"/>
+          </w:tcPr>
+          <w:p>
+            <w:pPr>
+              <w:jc w:val="center"/>
+              <w:rPr>
+                <w:rFonts w:ascii="Bodoni" w:eastAsia="Bodoni" w:hAnsi="Bodoni" w:cs="Bodoni"/>
+                <w:b/>
+                <w:bCs/>
+                <w:i/>
+                <w:iCs/>
+                <w:sz w:val="20"/>
+                <w:szCs w:val="20"/>
+              </w:rPr>
+            </w:pPr>
+            <w:r>
+              <w:rPr>
+                <w:rFonts w:ascii="Bodoni" w:eastAsia="Bodoni" w:hAnsi="Bodoni" w:cs="Bodoni"/>
+                <w:i/>
+                <w:iCs/>
+                <w:sz w:val="20"/>
+                <w:szCs w:val="20"/>
+              </w:rPr>
+              <w:t>{{municipio}}</w:t>
+            </w:r>
+          </w:p>
+        </w:tc>
+        <w:tc>
+          <w:tcPr>
+            <w:tcW w:w="1559" w:type="dxa"/>
+            <w:tcBorders>
+              <w:top w:val="single" w:sz="4" w:space="0" w:color="auto"/>
+              <w:bottom w:val="single" w:sz="4" w:space="0" w:color="auto"/>
+              <w:right w:val="single" w:sz="4" w:space="0" w:color="auto"/>
+            </w:tcBorders>
+            <w:vAlign w:val="center"/>
+          </w:tcPr>
+          <w:p>
+            <w:pPr>
+              <w:jc w:val="center"/>
+              <w:rPr>
+                <w:rFonts w:ascii="Bodoni" w:eastAsia="Bodoni" w:hAnsi="Bodoni" w:cs="Bodoni"/>
+                <w:b/>
+                <w:bCs/>
+                <w:i/>
+                <w:iCs/>
+                <w:sz w:val="20"/>
+                <w:szCs w:val="20"/>
+              </w:rPr>
+            </w:pPr>
+            <w:r>
+              <w:rPr>
+                <w:rFonts w:ascii="Bodoni" w:eastAsia="Bodoni" w:hAnsi="Bodoni" w:cs="Bodoni"/>
+                <w:i/>
+                <w:iCs/>
+                <w:sz w:val="20"/>
+                <w:szCs w:val="20"/>
+              </w:rPr>
+              <w:t>{{departamento}}{{/destinos}}</w:t>
             </w:r>
           </w:p>
         </w:tc>
@@ -472,7 +895,23 @@
           <w:sz w:val="22"/>
           <w:szCs w:val="22"/>
         </w:rPr>
-        <w:t>{{lugar_salida}}</w:t>
+        <w:t>{{</w:t>
+      </w:r>
+      <w:proofErr w:type="spellStart"/>
+      <w:r>
+        <w:rPr>
+          <w:sz w:val="22"/>
+          <w:szCs w:val="22"/>
+        </w:rPr>
+        <w:t>lugar_salida</w:t>
+      </w:r>
+      <w:proofErr w:type="spellEnd"/>
+      <w:r>
+        <w:rPr>
+          <w:sz w:val="22"/>
+          <w:szCs w:val="22"/>
+        </w:rPr>
+        <w:t>}}</w:t>
       </w:r>
       <w:r>
         <w:rPr>
@@ -486,7 +925,23 @@
           <w:sz w:val="22"/>
           <w:szCs w:val="22"/>
         </w:rPr>
-        <w:t>{{fecha_mision}}</w:t>
+        <w:t>{{</w:t>
+      </w:r>
+      <w:proofErr w:type="spellStart"/>
+      <w:r>
+        <w:rPr>
+          <w:sz w:val="22"/>
+          <w:szCs w:val="22"/>
+        </w:rPr>
+        <w:t>fecha_mision</w:t>
+      </w:r>
+      <w:proofErr w:type="spellEnd"/>
+      <w:r>
+        <w:rPr>
+          <w:sz w:val="22"/>
+          <w:szCs w:val="22"/>
+        </w:rPr>
+        <w:t>}}</w:t>
       </w:r>
       <w:r>
         <w:rPr>
@@ -526,158 +981,155 @@
           <w:sz w:val="22"/>
           <w:szCs w:val="22"/>
         </w:rPr>
-        <w:t>{{hora_salida}}</w:t>
-      </w:r>
-    </w:p>
-    <w:p>
-      <w:pPr>
-        <w:pStyle w:val="Standard"/>
-        <w:tabs>
-          <w:tab w:val="left" w:pos="3375"/>
-          <w:tab w:val="left" w:pos="3525"/>
-        </w:tabs>
-        <w:rPr>
-          <w:sz w:val="22"/>
-          <w:szCs w:val="22"/>
-        </w:rPr>
-      </w:pPr>
-    </w:p>
-    <w:p>
-      <w:pPr>
-        <w:pStyle w:val="Standard"/>
-        <w:tabs>
-          <w:tab w:val="left" w:pos="3375"/>
-          <w:tab w:val="left" w:pos="3525"/>
-        </w:tabs>
-        <w:rPr>
-          <w:sz w:val="22"/>
-          <w:szCs w:val="22"/>
-        </w:rPr>
-      </w:pPr>
-    </w:p>
-    <w:p>
-      <w:pPr>
-        <w:pStyle w:val="Standard"/>
-        <w:tabs>
-          <w:tab w:val="left" w:pos="3375"/>
-          <w:tab w:val="left" w:pos="3525"/>
-        </w:tabs>
-        <w:rPr>
-          <w:sz w:val="22"/>
-          <w:szCs w:val="22"/>
-        </w:rPr>
-      </w:pPr>
-      <w:r>
-        <w:rPr>
-          <w:sz w:val="22"/>
-          <w:szCs w:val="22"/>
-        </w:rPr>
-        <w:t xml:space="preserve">____________________________________   </w:t>
-      </w:r>
-    </w:p>
-    <w:p>
-      <w:pPr>
-        <w:pStyle w:val="Standard"/>
-        <w:tabs>
-          <w:tab w:val="left" w:pos="3375"/>
-          <w:tab w:val="left" w:pos="3525"/>
-        </w:tabs>
-        <w:rPr>
-          <w:sz w:val="22"/>
-          <w:szCs w:val="22"/>
-        </w:rPr>
-      </w:pPr>
-      <w:r>
-        <w:rPr>
-          <w:sz w:val="22"/>
-          <w:szCs w:val="22"/>
-        </w:rPr>
-        <w:t xml:space="preserve">Carlos Romeo Aguilar Marín                  </w:t>
-      </w:r>
-    </w:p>
-    <w:p>
-      <w:pPr>
-        <w:pStyle w:val="Standard"/>
-        <w:tabs>
-          <w:tab w:val="left" w:pos="3375"/>
-          <w:tab w:val="left" w:pos="3525"/>
-        </w:tabs>
-        <w:rPr>
-          <w:sz w:val="22"/>
-          <w:szCs w:val="22"/>
-        </w:rPr>
-      </w:pPr>
-      <w:r>
-        <w:rPr>
-          <w:sz w:val="22"/>
-          <w:szCs w:val="22"/>
-        </w:rPr>
-        <w:t>Encargado de la Sede de Soporte Técnico sede Santa Ana.</w:t>
-      </w:r>
-    </w:p>
-    <w:p>
-      <w:pPr>
-        <w:pStyle w:val="Standard"/>
-        <w:tabs>
-          <w:tab w:val="left" w:pos="3375"/>
-          <w:tab w:val="left" w:pos="3525"/>
-        </w:tabs>
-        <w:rPr>
-          <w:sz w:val="22"/>
-          <w:szCs w:val="22"/>
-        </w:rPr>
-      </w:pPr>
-    </w:p>
-    <w:p>
-      <w:pPr>
-        <w:pStyle w:val="Standard"/>
-        <w:tabs>
-          <w:tab w:val="left" w:pos="3375"/>
-          <w:tab w:val="left" w:pos="3525"/>
-        </w:tabs>
-        <w:rPr>
-          <w:sz w:val="22"/>
-          <w:szCs w:val="22"/>
-        </w:rPr>
-      </w:pPr>
-      <w:r>
-        <w:rPr>
-          <w:sz w:val="22"/>
-          <w:szCs w:val="22"/>
-        </w:rPr>
-        <w:t xml:space="preserve">-------------------------------------------------------------------------------------------------------------------------------------------------------                                                       </w:t>
-      </w:r>
-    </w:p>
-    <w:p>
-      <w:pPr>
-        <w:pStyle w:val="Standard"/>
-        <w:tabs>
-          <w:tab w:val="left" w:pos="3375"/>
-          <w:tab w:val="left" w:pos="3525"/>
-        </w:tabs>
+        <w:t>{{</w:t>
+      </w:r>
+      <w:proofErr w:type="spellStart"/>
+      <w:r>
         <w:rPr>
           <w:b/>
           <w:bCs/>
-        </w:rPr>
-      </w:pPr>
+          <w:sz w:val="22"/>
+          <w:szCs w:val="22"/>
+        </w:rPr>
+        <w:t>hora_salida</w:t>
+      </w:r>
+      <w:proofErr w:type="spellEnd"/>
       <w:r>
         <w:rPr>
           <w:b/>
           <w:bCs/>
-        </w:rPr>
-        <w:t>AUTORIZACIÓN DE MISIÓN</w:t>
-      </w:r>
-    </w:p>
-    <w:p>
-      <w:pPr>
-        <w:pStyle w:val="Standard"/>
-        <w:tabs>
-          <w:tab w:val="left" w:pos="3375"/>
-          <w:tab w:val="left" w:pos="3525"/>
-        </w:tabs>
+          <w:sz w:val="22"/>
+          <w:szCs w:val="22"/>
+        </w:rPr>
+        <w:t>}}</w:t>
+      </w:r>
+    </w:p>
+    <w:p>
+      <w:pPr>
+        <w:pStyle w:val="Standard"/>
+        <w:tabs>
+          <w:tab w:val="left" w:pos="3375"/>
+          <w:tab w:val="left" w:pos="3525"/>
+        </w:tabs>
+        <w:rPr>
+          <w:sz w:val="22"/>
+          <w:szCs w:val="22"/>
+        </w:rPr>
+      </w:pPr>
+    </w:p>
+    <w:p>
+      <w:pPr>
+        <w:pStyle w:val="Standard"/>
+        <w:tabs>
+          <w:tab w:val="left" w:pos="3375"/>
+          <w:tab w:val="left" w:pos="3525"/>
+        </w:tabs>
+        <w:rPr>
+          <w:sz w:val="22"/>
+          <w:szCs w:val="22"/>
+        </w:rPr>
+      </w:pPr>
+      <w:r>
+        <w:rPr>
+          <w:sz w:val="22"/>
+          <w:szCs w:val="22"/>
+        </w:rPr>
+        <w:t xml:space="preserve">____________________________________   </w:t>
+      </w:r>
+    </w:p>
+    <w:p>
+      <w:pPr>
+        <w:pStyle w:val="Standard"/>
+        <w:tabs>
+          <w:tab w:val="left" w:pos="3375"/>
+          <w:tab w:val="left" w:pos="3525"/>
+        </w:tabs>
+        <w:rPr>
+          <w:sz w:val="22"/>
+          <w:szCs w:val="22"/>
+        </w:rPr>
+      </w:pPr>
+      <w:r>
+        <w:rPr>
+          <w:sz w:val="22"/>
+          <w:szCs w:val="22"/>
+        </w:rPr>
+        <w:t xml:space="preserve">Carlos Romeo Aguilar Marín                  </w:t>
+      </w:r>
+    </w:p>
+    <w:p>
+      <w:pPr>
+        <w:pStyle w:val="Standard"/>
+        <w:tabs>
+          <w:tab w:val="left" w:pos="3375"/>
+          <w:tab w:val="left" w:pos="3525"/>
+        </w:tabs>
+        <w:rPr>
+          <w:sz w:val="22"/>
+          <w:szCs w:val="22"/>
+        </w:rPr>
+      </w:pPr>
+      <w:r>
+        <w:rPr>
+          <w:sz w:val="22"/>
+          <w:szCs w:val="22"/>
+        </w:rPr>
+        <w:t>Encargado de la Sede de Soporte Técnico sede Santa Ana.</w:t>
+      </w:r>
+    </w:p>
+    <w:p>
+      <w:pPr>
+        <w:pStyle w:val="Standard"/>
+        <w:tabs>
+          <w:tab w:val="left" w:pos="3375"/>
+          <w:tab w:val="left" w:pos="3525"/>
+        </w:tabs>
+        <w:rPr>
+          <w:sz w:val="22"/>
+          <w:szCs w:val="22"/>
+        </w:rPr>
+      </w:pPr>
+      <w:r>
+        <w:rPr>
+          <w:sz w:val="22"/>
+          <w:szCs w:val="22"/>
+        </w:rPr>
+        <w:t xml:space="preserve">            </w:t>
+      </w:r>
+    </w:p>
+    <w:p>
+      <w:pPr>
+        <w:pStyle w:val="Standard"/>
+        <w:tabs>
+          <w:tab w:val="left" w:pos="3375"/>
+          <w:tab w:val="left" w:pos="3525"/>
+        </w:tabs>
+        <w:jc w:val="center"/>
         <w:rPr>
           <w:b/>
           <w:bCs/>
+          <w:u w:val="single"/>
+        </w:rPr>
+      </w:pPr>
+      <w:r>
+        <w:rPr>
+          <w:b/>
+          <w:bCs/>
+          <w:u w:val="single"/>
+        </w:rPr>
+        <w:t>AUTORIZACIÓN DE MISIÓN</w:t>
+      </w:r>
+    </w:p>
+    <w:p>
+      <w:pPr>
+        <w:pStyle w:val="Standard"/>
+        <w:tabs>
+          <w:tab w:val="left" w:pos="3375"/>
+          <w:tab w:val="left" w:pos="3525"/>
+        </w:tabs>
+        <w:rPr>
+          <w:b/>
+          <w:bCs/>
         </w:rPr>
       </w:pPr>
     </w:p>
@@ -694,7 +1146,7 @@
         </w:rPr>
         <w:sectPr>
           <w:pgSz w:w="12240" w:h="15840"/>
-          <w:pgMar w:top="454" w:right="510" w:bottom="454" w:left="510" w:header="720" w:footer="720" w:gutter="0"/>
+          <w:pgMar w:top="0" w:right="510" w:bottom="454" w:left="510" w:header="720" w:footer="720" w:gutter="0"/>
           <w:cols w:space="720"/>
         </w:sectPr>
       </w:pPr>
@@ -743,8 +1195,8 @@
           <w:tab w:val="left" w:pos="3525"/>
         </w:tabs>
         <w:rPr>
-          <w:sz w:val="22"/>
-          <w:szCs w:val="22"/>
+          <w:sz w:val="12"/>
+          <w:szCs w:val="12"/>
         </w:rPr>
       </w:pPr>
     </w:p>
@@ -772,7 +1224,23 @@
           <w:sz w:val="22"/>
           <w:szCs w:val="22"/>
         </w:rPr>
-        <w:t>{{clase_vehiculo}}</w:t>
+        <w:t>{{</w:t>
+      </w:r>
+      <w:proofErr w:type="spellStart"/>
+      <w:r>
+        <w:rPr>
+          <w:sz w:val="22"/>
+          <w:szCs w:val="22"/>
+        </w:rPr>
+        <w:t>clase_vehiculo</w:t>
+      </w:r>
+      <w:proofErr w:type="spellEnd"/>
+      <w:r>
+        <w:rPr>
+          <w:sz w:val="22"/>
+          <w:szCs w:val="22"/>
+        </w:rPr>
+        <w:t>}}</w:t>
       </w:r>
       <w:r>
         <w:rPr>
@@ -790,8 +1258,8 @@
           <w:tab w:val="left" w:pos="3525"/>
         </w:tabs>
         <w:rPr>
-          <w:sz w:val="22"/>
-          <w:szCs w:val="22"/>
+          <w:sz w:val="16"/>
+          <w:szCs w:val="16"/>
         </w:rPr>
       </w:pPr>
     </w:p>
@@ -825,8 +1293,8 @@
         </w:tabs>
         <w:jc w:val="right"/>
         <w:rPr>
-          <w:sz w:val="22"/>
-          <w:szCs w:val="22"/>
+          <w:sz w:val="12"/>
+          <w:szCs w:val="12"/>
         </w:rPr>
       </w:pPr>
     </w:p>
@@ -915,6 +1383,8 @@
         <w:rPr>
           <w:b/>
           <w:bCs/>
+          <w:sz w:val="22"/>
+          <w:szCs w:val="22"/>
         </w:rPr>
         <w:t xml:space="preserve"> </w:t>
       </w:r>
@@ -1038,7 +1508,7 @@
           <w:sz w:val="22"/>
           <w:szCs w:val="22"/>
         </w:rPr>
-        <w:t>Firma y sello Jefe de Transporte</w:t>
+        <w:t>Salvador Iván Tesorero Valencia</w:t>
       </w:r>
     </w:p>
     <w:p>
@@ -1054,174 +1524,370 @@
           <w:szCs w:val="22"/>
         </w:rPr>
       </w:pPr>
-    </w:p>
-    <w:p>
-      <w:pPr>
-        <w:pStyle w:val="Standard"/>
-        <w:tabs>
-          <w:tab w:val="left" w:pos="3375"/>
-          <w:tab w:val="left" w:pos="3525"/>
-        </w:tabs>
-      </w:pPr>
-      <w:r>
-        <w:t>CONSTANCIA DE CUMPLIMIENTO DE MISIÓN</w:t>
-      </w:r>
-    </w:p>
-    <w:p>
-      <w:pPr>
-        <w:pStyle w:val="Standard"/>
-        <w:tabs>
-          <w:tab w:val="left" w:pos="3375"/>
-          <w:tab w:val="left" w:pos="3525"/>
-        </w:tabs>
-      </w:pPr>
-    </w:p>
-    <w:p>
-      <w:pPr>
-        <w:pStyle w:val="Standard"/>
-        <w:tabs>
-          <w:tab w:val="left" w:pos="3375"/>
-          <w:tab w:val="left" w:pos="3525"/>
-        </w:tabs>
-        <w:rPr>
-          <w:sz w:val="22"/>
-          <w:szCs w:val="22"/>
-        </w:rPr>
-      </w:pPr>
-      <w:r>
-        <w:rPr>
-          <w:sz w:val="22"/>
-          <w:szCs w:val="22"/>
-        </w:rPr>
-        <w:t xml:space="preserve">Por este medio notifico a usted, que el señor motorista </w:t>
-      </w:r>
-      <w:r>
+      <w:r>
+        <w:rPr>
+          <w:sz w:val="22"/>
+          <w:szCs w:val="22"/>
+        </w:rPr>
+        <w:t>Firma y sello del encargado de Combustible</w:t>
+      </w:r>
+    </w:p>
+    <w:p>
+      <w:pPr>
+        <w:pStyle w:val="Ttulo5"/>
+        <w:rPr>
+          <w:rFonts w:ascii="Candara" w:eastAsia="Candara" w:hAnsi="Candara" w:cs="Candara"/>
+          <w:i w:val="0"/>
+          <w:iCs w:val="0"/>
+          <w:sz w:val="20"/>
+          <w:szCs w:val="20"/>
+          <w:u w:val="single"/>
+        </w:rPr>
+      </w:pPr>
+      <w:r>
+        <w:rPr>
+          <w:noProof/>
+        </w:rPr>
+        <mc:AlternateContent>
+          <mc:Choice Requires="wps">
+            <w:drawing>
+              <wp:anchor distT="4294967295" distB="4294967295" distL="114300" distR="114300" simplePos="0" relativeHeight="251670528" behindDoc="0" locked="0" layoutInCell="1" hidden="0" allowOverlap="1" wp14:anchorId="1FA2BBAD" wp14:editId="01225D7A">
+                <wp:simplePos x="0" y="0"/>
+                <wp:positionH relativeFrom="margin">
+                  <wp:posOffset>31529</wp:posOffset>
+                </wp:positionH>
+                <wp:positionV relativeFrom="paragraph">
+                  <wp:posOffset>147955</wp:posOffset>
+                </wp:positionV>
+                <wp:extent cx="6967220" cy="45085"/>
+                <wp:effectExtent l="0" t="0" r="24130" b="31115"/>
+                <wp:wrapNone/>
+                <wp:docPr id="800352023" name="Conector recto de flecha 800352023"/>
+                <wp:cNvGraphicFramePr/>
+                <a:graphic xmlns:a="http://schemas.openxmlformats.org/drawingml/2006/main">
+                  <a:graphicData uri="http://schemas.microsoft.com/office/word/2010/wordprocessingShape">
+                    <wps:wsp>
+                      <wps:cNvCnPr/>
+                      <wps:spPr>
+                        <a:xfrm>
+                          <a:off x="0" y="0"/>
+                          <a:ext cx="6967220" cy="45085"/>
+                        </a:xfrm>
+                        <a:prstGeom prst="straightConnector1">
+                          <a:avLst/>
+                        </a:prstGeom>
+                        <a:noFill/>
+                        <a:ln w="19050" cap="flat" cmpd="sng">
+                          <a:solidFill>
+                            <a:schemeClr val="dk1"/>
+                          </a:solidFill>
+                          <a:prstDash val="lgDash"/>
+                          <a:round/>
+                          <a:headEnd type="none" w="sm" len="sm"/>
+                          <a:tailEnd type="none" w="sm" len="sm"/>
+                        </a:ln>
+                      </wps:spPr>
+                      <wps:bodyPr/>
+                    </wps:wsp>
+                  </a:graphicData>
+                </a:graphic>
+                <wp14:sizeRelH relativeFrom="margin">
+                  <wp14:pctWidth>0</wp14:pctWidth>
+                </wp14:sizeRelH>
+                <wp14:sizeRelV relativeFrom="margin">
+                  <wp14:pctHeight>0</wp14:pctHeight>
+                </wp14:sizeRelV>
+              </wp:anchor>
+            </w:drawing>
+          </mc:Choice>
+          <mc:Fallback>
+            <w:pict>
+              <v:shapetype w14:anchorId="5E0442E6" id="_x0000_t32" coordsize="21600,21600" o:spt="32" o:oned="t" path="m,l21600,21600e" filled="f">
+                <v:path arrowok="t" fillok="f" o:connecttype="none"/>
+                <o:lock v:ext="edit" shapetype="t"/>
+              </v:shapetype>
+              <v:shape id="Conector recto de flecha 800352023" o:spid="_x0000_s1026" type="#_x0000_t32" style="position:absolute;margin-left:2.5pt;margin-top:11.65pt;width:548.6pt;height:3.55pt;z-index:251670528;visibility:visible;mso-wrap-style:square;mso-width-percent:0;mso-height-percent:0;mso-wrap-distance-left:9pt;mso-wrap-distance-top:-3e-5mm;mso-wrap-distance-right:9pt;mso-wrap-distance-bottom:-3e-5mm;mso-position-horizontal:absolute;mso-position-horizontal-relative:margin;mso-position-vertical:absolute;mso-position-vertical-relative:text;mso-width-percent:0;mso-height-percent:0;mso-width-relative:margin;mso-height-relative:margin" o:gfxdata="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" strokecolor="black [3200]" strokeweight="1.5pt">
+                <v:stroke dashstyle="longDash" startarrowwidth="narrow" startarrowlength="short" endarrowwidth="narrow" endarrowlength="short"/>
+                <w10:wrap anchorx="margin"/>
+              </v:shape>
+            </w:pict>
+          </mc:Fallback>
+        </mc:AlternateContent>
+      </w:r>
+    </w:p>
+    <w:p>
+      <w:pPr>
+        <w:pStyle w:val="Standard"/>
+        <w:tabs>
+          <w:tab w:val="left" w:pos="3375"/>
+          <w:tab w:val="left" w:pos="3525"/>
+        </w:tabs>
+      </w:pPr>
+    </w:p>
+    <w:p>
+      <w:pPr>
+        <w:pStyle w:val="Standard"/>
+        <w:tabs>
+          <w:tab w:val="left" w:pos="3375"/>
+          <w:tab w:val="left" w:pos="3525"/>
+        </w:tabs>
+        <w:jc w:val="center"/>
         <w:rPr>
           <w:b/>
           <w:bCs/>
-          <w:sz w:val="22"/>
-          <w:szCs w:val="22"/>
-        </w:rPr>
-        <w:t>{{nombre_motorista}}</w:t>
-      </w:r>
-    </w:p>
-    <w:p>
-      <w:pPr>
-        <w:pStyle w:val="Standard"/>
-        <w:tabs>
-          <w:tab w:val="left" w:pos="3375"/>
-          <w:tab w:val="left" w:pos="3525"/>
-        </w:tabs>
-        <w:rPr>
-          <w:sz w:val="22"/>
-          <w:szCs w:val="22"/>
-        </w:rPr>
-      </w:pPr>
-      <w:r>
-        <w:rPr>
-          <w:sz w:val="22"/>
-          <w:szCs w:val="22"/>
-        </w:rPr>
-        <w:t>Me acompañ</w:t>
-      </w:r>
-      <w:r>
-        <w:rPr>
-          <w:sz w:val="22"/>
-          <w:szCs w:val="22"/>
-        </w:rPr>
-        <w:t>ó</w:t>
-      </w:r>
-      <w:r>
-        <w:rPr>
-          <w:sz w:val="22"/>
-          <w:szCs w:val="22"/>
-        </w:rPr>
-        <w:t xml:space="preserve"> a cumplir misión oficial, saliendo a las ________________________ y regresando _____________________</w:t>
-      </w:r>
-    </w:p>
-    <w:p>
-      <w:pPr>
-        <w:pStyle w:val="Standard"/>
-        <w:tabs>
-          <w:tab w:val="left" w:pos="3375"/>
-          <w:tab w:val="left" w:pos="3525"/>
-        </w:tabs>
-        <w:jc w:val="center"/>
-        <w:rPr>
-          <w:sz w:val="22"/>
-          <w:szCs w:val="22"/>
-        </w:rPr>
-      </w:pPr>
-    </w:p>
-    <w:p>
-      <w:pPr>
-        <w:pStyle w:val="Standard"/>
-        <w:tabs>
-          <w:tab w:val="left" w:pos="3375"/>
-          <w:tab w:val="left" w:pos="3525"/>
-        </w:tabs>
-        <w:jc w:val="center"/>
-        <w:rPr>
-          <w:sz w:val="22"/>
-          <w:szCs w:val="22"/>
-        </w:rPr>
-      </w:pPr>
-      <w:r>
-        <w:rPr>
-          <w:sz w:val="22"/>
-          <w:szCs w:val="22"/>
-        </w:rPr>
-        <w:t>__________________________________________________________</w:t>
-      </w:r>
-    </w:p>
-    <w:p>
-      <w:pPr>
-        <w:pStyle w:val="Standard"/>
-        <w:tabs>
-          <w:tab w:val="left" w:pos="3375"/>
-          <w:tab w:val="left" w:pos="3525"/>
-        </w:tabs>
-        <w:jc w:val="center"/>
-        <w:rPr>
-          <w:sz w:val="22"/>
-          <w:szCs w:val="22"/>
-        </w:rPr>
-      </w:pPr>
-      <w:r>
-        <w:rPr>
-          <w:sz w:val="22"/>
-          <w:szCs w:val="22"/>
-        </w:rPr>
-        <w:t>Nombre y firma del funcionario que recibió el servicio</w:t>
-      </w:r>
-    </w:p>
-    <w:p>
-      <w:pPr>
-        <w:pStyle w:val="Standard"/>
-        <w:tabs>
-          <w:tab w:val="left" w:pos="3375"/>
-          <w:tab w:val="left" w:pos="3525"/>
-        </w:tabs>
-        <w:jc w:val="center"/>
-      </w:pPr>
-    </w:p>
-    <w:p>
-      <w:pPr>
-        <w:pStyle w:val="Standard"/>
-        <w:tabs>
-          <w:tab w:val="left" w:pos="3375"/>
-          <w:tab w:val="left" w:pos="3525"/>
-        </w:tabs>
-        <w:jc w:val="center"/>
+          <w:u w:val="single"/>
+        </w:rPr>
+      </w:pPr>
+      <w:r>
         <w:rPr>
           <w:b/>
           <w:bCs/>
-        </w:rPr>
-      </w:pPr>
+          <w:u w:val="single"/>
+        </w:rPr>
+        <w:t>CONSTANCIA DE CUMPLIMIENTO DE MISIÓN</w:t>
+      </w:r>
+    </w:p>
+    <w:p>
+      <w:pPr>
+        <w:pStyle w:val="Standard"/>
+        <w:tabs>
+          <w:tab w:val="left" w:pos="3375"/>
+          <w:tab w:val="left" w:pos="3525"/>
+        </w:tabs>
+      </w:pPr>
+    </w:p>
+    <w:p>
+      <w:pPr>
+        <w:pStyle w:val="Standard"/>
+        <w:tabs>
+          <w:tab w:val="left" w:pos="3375"/>
+          <w:tab w:val="left" w:pos="3525"/>
+        </w:tabs>
+        <w:rPr>
+          <w:sz w:val="22"/>
+          <w:szCs w:val="22"/>
+        </w:rPr>
+      </w:pPr>
+      <w:r>
+        <w:rPr>
+          <w:sz w:val="22"/>
+          <w:szCs w:val="22"/>
+        </w:rPr>
+        <w:t xml:space="preserve">Por este medio notifico a usted, que el señor motorista </w:t>
+      </w:r>
       <w:r>
         <w:rPr>
           <w:b/>
           <w:bCs/>
+          <w:sz w:val="22"/>
+          <w:szCs w:val="22"/>
+        </w:rPr>
+        <w:t>{{</w:t>
+      </w:r>
+      <w:proofErr w:type="spellStart"/>
+      <w:r>
+        <w:rPr>
+          <w:b/>
+          <w:bCs/>
+          <w:sz w:val="22"/>
+          <w:szCs w:val="22"/>
+        </w:rPr>
+        <w:t>nombre_motorista</w:t>
+      </w:r>
+      <w:proofErr w:type="spellEnd"/>
+      <w:r>
+        <w:rPr>
+          <w:b/>
+          <w:bCs/>
+          <w:sz w:val="22"/>
+          <w:szCs w:val="22"/>
+        </w:rPr>
+        <w:t>}}</w:t>
+      </w:r>
+    </w:p>
+    <w:p>
+      <w:pPr>
+        <w:pStyle w:val="Standard"/>
+        <w:tabs>
+          <w:tab w:val="left" w:pos="3375"/>
+          <w:tab w:val="left" w:pos="3525"/>
+        </w:tabs>
+        <w:rPr>
+          <w:sz w:val="22"/>
+          <w:szCs w:val="22"/>
+        </w:rPr>
+      </w:pPr>
+      <w:r>
+        <w:rPr>
+          <w:sz w:val="22"/>
+          <w:szCs w:val="22"/>
+        </w:rPr>
+        <w:t>Me acompañ</w:t>
+      </w:r>
+      <w:r>
+        <w:rPr>
+          <w:sz w:val="22"/>
+          <w:szCs w:val="22"/>
+        </w:rPr>
+        <w:t>ó</w:t>
+      </w:r>
+      <w:r>
+        <w:rPr>
+          <w:sz w:val="22"/>
+          <w:szCs w:val="22"/>
+        </w:rPr>
+        <w:t xml:space="preserve"> a cumplir misión oficial, saliendo a las ________________________ y regresando _____________________</w:t>
+      </w:r>
+    </w:p>
+    <w:p>
+      <w:pPr>
+        <w:pStyle w:val="Standard"/>
+        <w:tabs>
+          <w:tab w:val="left" w:pos="3375"/>
+          <w:tab w:val="left" w:pos="3525"/>
+        </w:tabs>
+        <w:jc w:val="center"/>
+        <w:rPr>
+          <w:sz w:val="22"/>
+          <w:szCs w:val="22"/>
+        </w:rPr>
+      </w:pPr>
+    </w:p>
+    <w:p>
+      <w:pPr>
+        <w:pStyle w:val="Standard"/>
+        <w:tabs>
+          <w:tab w:val="left" w:pos="3375"/>
+          <w:tab w:val="left" w:pos="3525"/>
+        </w:tabs>
+        <w:jc w:val="center"/>
+        <w:rPr>
+          <w:sz w:val="22"/>
+          <w:szCs w:val="22"/>
+        </w:rPr>
+      </w:pPr>
+      <w:r>
+        <w:rPr>
+          <w:sz w:val="22"/>
+          <w:szCs w:val="22"/>
+        </w:rPr>
+        <w:t>__________________________________________________________</w:t>
+      </w:r>
+    </w:p>
+    <w:p>
+      <w:pPr>
+        <w:pStyle w:val="Standard"/>
+        <w:tabs>
+          <w:tab w:val="left" w:pos="3375"/>
+          <w:tab w:val="left" w:pos="3525"/>
+        </w:tabs>
+        <w:jc w:val="center"/>
+        <w:rPr>
+          <w:sz w:val="22"/>
+          <w:szCs w:val="22"/>
+        </w:rPr>
+      </w:pPr>
+      <w:r>
+        <w:rPr>
+          <w:sz w:val="22"/>
+          <w:szCs w:val="22"/>
+        </w:rPr>
+        <w:t>Nombre y firma del funcionario que recibió el servicio</w:t>
+      </w:r>
+    </w:p>
+    <w:p>
+      <w:pPr>
+        <w:pStyle w:val="Standard"/>
+        <w:tabs>
+          <w:tab w:val="left" w:pos="3375"/>
+          <w:tab w:val="left" w:pos="3525"/>
+        </w:tabs>
+        <w:jc w:val="center"/>
+      </w:pPr>
+      <w:r>
+        <w:rPr>
+          <w:noProof/>
+        </w:rPr>
+        <mc:AlternateContent>
+          <mc:Choice Requires="wps">
+            <w:drawing>
+              <wp:anchor distT="4294967295" distB="4294967295" distL="114300" distR="114300" simplePos="0" relativeHeight="251668480" behindDoc="0" locked="0" layoutInCell="1" hidden="0" allowOverlap="1" wp14:anchorId="3A2AE0D1" wp14:editId="3D8B5537">
+                <wp:simplePos x="0" y="0"/>
+                <wp:positionH relativeFrom="margin">
+                  <wp:posOffset>0</wp:posOffset>
+                </wp:positionH>
+                <wp:positionV relativeFrom="paragraph">
+                  <wp:posOffset>60739</wp:posOffset>
+                </wp:positionV>
+                <wp:extent cx="6967220" cy="45085"/>
+                <wp:effectExtent l="0" t="0" r="24130" b="31115"/>
+                <wp:wrapNone/>
+                <wp:docPr id="1278219645" name="Conector recto de flecha 1278219645"/>
+                <wp:cNvGraphicFramePr/>
+                <a:graphic xmlns:a="http://schemas.openxmlformats.org/drawingml/2006/main">
+                  <a:graphicData uri="http://schemas.microsoft.com/office/word/2010/wordprocessingShape">
+                    <wps:wsp>
+                      <wps:cNvCnPr/>
+                      <wps:spPr>
+                        <a:xfrm>
+                          <a:off x="0" y="0"/>
+                          <a:ext cx="6967220" cy="45085"/>
+                        </a:xfrm>
+                        <a:prstGeom prst="straightConnector1">
+                          <a:avLst/>
+                        </a:prstGeom>
+                        <a:noFill/>
+                        <a:ln w="19050" cap="flat" cmpd="sng">
+                          <a:solidFill>
+                            <a:schemeClr val="dk1"/>
+                          </a:solidFill>
+                          <a:prstDash val="lgDash"/>
+                          <a:round/>
+                          <a:headEnd type="none" w="sm" len="sm"/>
+                          <a:tailEnd type="none" w="sm" len="sm"/>
+                        </a:ln>
+                      </wps:spPr>
+                      <wps:bodyPr/>
+                    </wps:wsp>
+                  </a:graphicData>
+                </a:graphic>
+                <wp14:sizeRelH relativeFrom="margin">
+                  <wp14:pctWidth>0</wp14:pctWidth>
+                </wp14:sizeRelH>
+                <wp14:sizeRelV relativeFrom="margin">
+                  <wp14:pctHeight>0</wp14:pctHeight>
+                </wp14:sizeRelV>
+              </wp:anchor>
+            </w:drawing>
+          </mc:Choice>
+          <mc:Fallback>
+            <w:pict>
+              <v:shape w14:anchorId="1BAA5303" id="Conector recto de flecha 1278219645" o:spid="_x0000_s1026" type="#_x0000_t32" style="position:absolute;margin-left:0;margin-top:4.8pt;width:548.6pt;height:3.55pt;z-index:251668480;visibility:visible;mso-wrap-style:square;mso-width-percent:0;mso-height-percent:0;mso-wrap-distance-left:9pt;mso-wrap-distance-top:-3e-5mm;mso-wrap-distance-right:9pt;mso-wrap-distance-bottom:-3e-5mm;mso-position-horizontal:absolute;mso-position-horizontal-relative:margin;mso-position-vertical:absolute;mso-position-vertical-relative:text;mso-width-percent:0;mso-height-percent:0;mso-width-relative:margin;mso-height-relative:margin" o:gfxdata="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" strokecolor="black [3200]" strokeweight="1.5pt">
+                <v:stroke dashstyle="longDash" startarrowwidth="narrow" startarrowlength="short" endarrowwidth="narrow" endarrowlength="short"/>
+                <w10:wrap anchorx="margin"/>
+              </v:shape>
+            </w:pict>
+          </mc:Fallback>
+        </mc:AlternateContent>
+      </w:r>
+    </w:p>
+    <w:p>
+      <w:pPr>
+        <w:pStyle w:val="Standard"/>
+        <w:tabs>
+          <w:tab w:val="left" w:pos="3375"/>
+          <w:tab w:val="left" w:pos="3525"/>
+        </w:tabs>
+        <w:jc w:val="center"/>
+        <w:rPr>
+          <w:b/>
+          <w:bCs/>
+        </w:rPr>
+      </w:pPr>
+      <w:r>
+        <w:rPr>
+          <w:b/>
+          <w:bCs/>
         </w:rPr>
         <w:t>PARA USO DE ÁREA DE TRANSPORTE</w:t>
       </w:r>
@@ -1233,13 +1899,18 @@
           <w:tab w:val="left" w:pos="3375"/>
           <w:tab w:val="left" w:pos="3525"/>
         </w:tabs>
-      </w:pPr>
-      <w:r>
-        <w:rPr>
-          <w:sz w:val="22"/>
-          <w:szCs w:val="22"/>
-        </w:rPr>
-        <w:t xml:space="preserve">Observaciones:_____________________________________________________________________________________________________________________________________________________________________________________________________________________________________________________________________________________________________ </w:t>
+        <w:spacing w:line="360" w:lineRule="auto"/>
+        <w:rPr>
+          <w:sz w:val="22"/>
+          <w:szCs w:val="22"/>
+        </w:rPr>
+      </w:pPr>
+      <w:r>
+        <w:rPr>
+          <w:sz w:val="22"/>
+          <w:szCs w:val="22"/>
+        </w:rPr>
+        <w:t xml:space="preserve">Observaciones:_______________________________________________________________________________________________________________________________________________________________________________________________ </w:t>
       </w:r>
     </w:p>
     <w:sectPr>
@@ -1253,7 +1924,7 @@
 </file>
 
 <file path=word/endnotes.xml><?xml version="1.0" encoding="utf-8"?>
-<w:endnotes xmlns:wpc="http://schemas.microsoft.com/office/word/2010/wordprocessingCanvas" xmlns:cx="http://schemas.microsoft.com/office/drawing/2014/chartex" xmlns:cx1="http://schemas.microsoft.com/office/drawing/2015/9/8/chartex" xmlns:cx2="http://schemas.microsoft.com/office/drawing/2015/10/21/chartex" xmlns:cx3="http://schemas.microsoft.com/office/drawing/2016/5/9/chartex" xmlns:cx4="http://schemas.microsoft.com/office/drawing/2016/5/10/chartex" xmlns:cx5="http://schemas.microsoft.com/office/drawing/2016/5/11/chartex" xmlns:cx6="http://schemas.microsoft.com/office/drawing/2016/5/12/chartex" xmlns:cx7="http://schemas.microsoft.com/office/drawing/2016/5/13/chartex" xmlns:cx8="http://schemas.microsoft.com/office/drawing/2016/5/14/chartex" xmlns:mc="http://schemas.openxmlformats.org/markup-compatibility/2006" xmlns:aink="http://schemas.microsoft.com/office/drawing/2016/ink" xmlns:am3d="http://schemas.microsoft.com/office/drawing/2017/model3d" xmlns:o="urn:schemas-microsoft-com:office:office" xmlns:oel="http://schemas.microsoft.com/office/2019/extlst" xmlns:r="http://schemas.openxmlformats.org/officeDocument/2006/relationships" xmlns:m="http://schemas.openxmlformats.org/officeDocument/2006/math" xmlns:v="urn:schemas-microsoft-com:vml" xmlns:wp14="http://schemas.microsoft.com/office/word/2010/wordprocessingDrawing" xmlns:wp="http://schemas.openxmlformats.org/drawingml/2006/wordprocessingDrawing" xmlns:w10="urn:schemas-microsoft-com:office:word" xmlns:w="http://schemas.openxmlformats.org/wordprocessingml/2006/main" xmlns:w14="http://schemas.microsoft.com/office/word/2010/wordml" xmlns:w15="http://schemas.microsoft.com/office/word/2012/wordml" xmlns:w16cex="http://schemas.microsoft.com/office/word/2018/wordml/cex" xmlns:w16cid="http://schemas.microsoft.com/office/word/2016/wordml/cid" xmlns:w16="http://schemas.microsoft.com/office/word/2018/wordml" xmlns:w16du="http://schemas.microsoft.com/office/word/2023/wordml/word16du" xmlns:w16sdtdh="http://schemas.microsoft.com/office/word/2020/wordml/sdtdatahash" xmlns:w16sdtfl="http://schemas.microsoft.com/office/word/2024/wordml/sdtformatlock" xmlns:w16se="http://schemas.microsoft.com/office/word/2015/wordml/symex" xmlns:wpg="http://schemas.microsoft.com/office/word/2010/wordprocessingGroup" xmlns:wpi="http://schemas.microsoft.com/office/word/2010/wordprocessingInk" xmlns:wne="http://schemas.microsoft.com/office/word/2006/wordml" xmlns:wps="http://schemas.microsoft.com/office/word/2010/wordprocessingShape" mc:Ignorable="w14 w15 w16se w16cid w16 w16cex w16sdtdh w16sdtfl w16du wp14">
+<w:endnotes xmlns:wpc="http://schemas.microsoft.com/office/word/2010/wordprocessingCanvas" xmlns:cx="http://schemas.microsoft.com/office/drawing/2014/chartex" xmlns:cx1="http://schemas.microsoft.com/office/drawing/2015/9/8/chartex" xmlns:cx2="http://schemas.microsoft.com/office/drawing/2015/10/21/chartex" xmlns:cx3="http://schemas.microsoft.com/office/drawing/2016/5/9/chartex" xmlns:cx4="http://schemas.microsoft.com/office/drawing/2016/5/10/chartex" xmlns:cx5="http://schemas.microsoft.com/office/drawing/2016/5/11/chartex" xmlns:cx6="http://schemas.microsoft.com/office/drawing/2016/5/12/chartex" xmlns:cx7="http://schemas.microsoft.com/office/drawing/2016/5/13/chartex" xmlns:cx8="http://schemas.microsoft.com/office/drawing/2016/5/14/chartex" xmlns:mc="http://schemas.openxmlformats.org/markup-compatibility/2006" xmlns:aink="http://schemas.microsoft.com/office/drawing/2016/ink" xmlns:am3d="http://schemas.microsoft.com/office/drawing/2017/model3d" xmlns:o="urn:schemas-microsoft-com:office:office" xmlns:oel="http://schemas.microsoft.com/office/2019/extlst" xmlns:r="http://schemas.openxmlformats.org/officeDocument/2006/relationships" xmlns:m="http://schemas.openxmlformats.org/officeDocument/2006/math" xmlns:v="urn:schemas-microsoft-com:vml" xmlns:wp14="http://schemas.microsoft.com/office/word/2010/wordprocessingDrawing" xmlns:wp="http://schemas.openxmlformats.org/drawingml/2006/wordprocessingDrawing" xmlns:w10="urn:schemas-microsoft-com:office:word" xmlns:w="http://schemas.openxmlformats.org/wordprocessingml/2006/main" xmlns:w14="http://schemas.microsoft.com/office/word/2010/wordml" xmlns:w15="http://schemas.microsoft.com/office/word/2012/wordml" xmlns:w16cei="http://schemas.microsoft.com/office/word/2026/wordml/cei" xmlns:w16cex="http://schemas.microsoft.com/office/word/2018/wordml/cex" xmlns:w16cid="http://schemas.microsoft.com/office/word/2016/wordml/cid" xmlns:w16="http://schemas.microsoft.com/office/word/2018/wordml" xmlns:w16du="http://schemas.microsoft.com/office/word/2023/wordml/word16du" xmlns:w16sdtdh="http://schemas.microsoft.com/office/word/2020/wordml/sdtdatahash" xmlns:w16sdtfl="http://schemas.microsoft.com/office/word/2024/wordml/sdtformatlock" xmlns:w16se="http://schemas.microsoft.com/office/word/2015/wordml/symex" xmlns:wpg="http://schemas.microsoft.com/office/word/2010/wordprocessingGroup" xmlns:wpi="http://schemas.microsoft.com/office/word/2010/wordprocessingInk" xmlns:wne="http://schemas.microsoft.com/office/word/2006/wordml" xmlns:wps="http://schemas.microsoft.com/office/word/2010/wordprocessingShape" mc:Ignorable="w14 w15 w16se w16cid w16 w16cex w16sdtdh w16sdtfl w16du wp14">
   <w:endnote w:type="separator" w:id="-1">
     <w:p>
       <w:r>
@@ -1272,7 +1943,7 @@
 </file>
 
 <file path=word/footnotes.xml><?xml version="1.0" encoding="utf-8"?>
-<w:footnotes xmlns:wpc="http://schemas.microsoft.com/office/word/2010/wordprocessingCanvas" xmlns:cx="http://schemas.microsoft.com/office/drawing/2014/chartex" xmlns:cx1="http://schemas.microsoft.com/office/drawing/2015/9/8/chartex" xmlns:cx2="http://schemas.microsoft.com/office/drawing/2015/10/21/chartex" xmlns:cx3="http://schemas.microsoft.com/office/drawing/2016/5/9/chartex" xmlns:cx4="http://schemas.microsoft.com/office/drawing/2016/5/10/chartex" xmlns:cx5="http://schemas.microsoft.com/office/drawing/2016/5/11/chartex" xmlns:cx6="http://schemas.microsoft.com/office/drawing/2016/5/12/chartex" xmlns:cx7="http://schemas.microsoft.com/office/drawing/2016/5/13/chartex" xmlns:cx8="http://schemas.microsoft.com/office/drawing/2016/5/14/chartex" xmlns:mc="http://schemas.openxmlformats.org/markup-compatibility/2006" xmlns:aink="http://schemas.microsoft.com/office/drawing/2016/ink" xmlns:am3d="http://schemas.microsoft.com/office/drawing/2017/model3d" xmlns:o="urn:schemas-microsoft-com:office:office" xmlns:oel="http://schemas.microsoft.com/office/2019/extlst" xmlns:r="http://schemas.openxmlformats.org/officeDocument/2006/relationships" xmlns:m="http://schemas.openxmlformats.org/officeDocument/2006/math" xmlns:v="urn:schemas-microsoft-com:vml" xmlns:wp14="http://schemas.microsoft.com/office/word/2010/wordprocessingDrawing" xmlns:wp="http://schemas.openxmlformats.org/drawingml/2006/wordprocessingDrawing" xmlns:w10="urn:schemas-microsoft-com:office:word" xmlns:w="http://schemas.openxmlformats.org/wordprocessingml/2006/main" xmlns:w14="http://schemas.microsoft.com/office/word/2010/wordml" xmlns:w15="http://schemas.microsoft.com/office/word/2012/wordml" xmlns:w16cex="http://schemas.microsoft.com/office/word/2018/wordml/cex" xmlns:w16cid="http://schemas.microsoft.com/office/word/2016/wordml/cid" xmlns:w16="http://schemas.microsoft.com/office/word/2018/wordml" xmlns:w16du="http://schemas.microsoft.com/office/word/2023/wordml/word16du" xmlns:w16sdtdh="http://schemas.microsoft.com/office/word/2020/wordml/sdtdatahash" xmlns:w16sdtfl="http://schemas.microsoft.com/office/word/2024/wordml/sdtformatlock" xmlns:w16se="http://schemas.microsoft.com/office/word/2015/wordml/symex" xmlns:wpg="http://schemas.microsoft.com/office/word/2010/wordprocessingGroup" xmlns:wpi="http://schemas.microsoft.com/office/word/2010/wordprocessingInk" xmlns:wne="http://schemas.microsoft.com/office/word/2006/wordml" xmlns:wps="http://schemas.microsoft.com/office/word/2010/wordprocessingShape" mc:Ignorable="w14 w15 w16se w16cid w16 w16cex w16sdtdh w16sdtfl w16du wp14">
+<w:footnotes xmlns:wpc="http://schemas.microsoft.com/office/word/2010/wordprocessingCanvas" xmlns:cx="http://schemas.microsoft.com/office/drawing/2014/chartex" xmlns:cx1="http://schemas.microsoft.com/office/drawing/2015/9/8/chartex" xmlns:cx2="http://schemas.microsoft.com/office/drawing/2015/10/21/chartex" xmlns:cx3="http://schemas.microsoft.com/office/drawing/2016/5/9/chartex" xmlns:cx4="http://schemas.microsoft.com/office/drawing/2016/5/10/chartex" xmlns:cx5="http://schemas.microsoft.com/office/drawing/2016/5/11/chartex" xmlns:cx6="http://schemas.microsoft.com/office/drawing/2016/5/12/chartex" xmlns:cx7="http://schemas.microsoft.com/office/drawing/2016/5/13/chartex" xmlns:cx8="http://schemas.microsoft.com/office/drawing/2016/5/14/chartex" xmlns:mc="http://schemas.openxmlformats.org/markup-compatibility/2006" xmlns:aink="http://schemas.microsoft.com/office/drawing/2016/ink" xmlns:am3d="http://schemas.microsoft.com/office/drawing/2017/model3d" xmlns:o="urn:schemas-microsoft-com:office:office" xmlns:oel="http://schemas.microsoft.com/office/2019/extlst" xmlns:r="http://schemas.openxmlformats.org/officeDocument/2006/relationships" xmlns:m="http://schemas.openxmlformats.org/officeDocument/2006/math" xmlns:v="urn:schemas-microsoft-com:vml" xmlns:wp14="http://schemas.microsoft.com/office/word/2010/wordprocessingDrawing" xmlns:wp="http://schemas.openxmlformats.org/drawingml/2006/wordprocessingDrawing" xmlns:w10="urn:schemas-microsoft-com:office:word" xmlns:w="http://schemas.openxmlformats.org/wordprocessingml/2006/main" xmlns:w14="http://schemas.microsoft.com/office/word/2010/wordml" xmlns:w15="http://schemas.microsoft.com/office/word/2012/wordml" xmlns:w16cei="http://schemas.microsoft.com/office/word/2026/wordml/cei" xmlns:w16cex="http://schemas.microsoft.com/office/word/2018/wordml/cex" xmlns:w16cid="http://schemas.microsoft.com/office/word/2016/wordml/cid" xmlns:w16="http://schemas.microsoft.com/office/word/2018/wordml" xmlns:w16du="http://schemas.microsoft.com/office/word/2023/wordml/word16du" xmlns:w16sdtdh="http://schemas.microsoft.com/office/word/2020/wordml/sdtdatahash" xmlns:w16sdtfl="http://schemas.microsoft.com/office/word/2024/wordml/sdtformatlock" xmlns:w16se="http://schemas.microsoft.com/office/word/2015/wordml/symex" xmlns:wpg="http://schemas.microsoft.com/office/word/2010/wordprocessingGroup" xmlns:wpi="http://schemas.microsoft.com/office/word/2010/wordprocessingInk" xmlns:wne="http://schemas.microsoft.com/office/word/2006/wordml" xmlns:wps="http://schemas.microsoft.com/office/word/2010/wordprocessingShape" mc:Ignorable="w14 w15 w16se w16cid w16 w16cex w16sdtdh w16sdtfl w16du wp14">
   <w:footnote w:type="separator" w:id="-1">
     <w:p>
       <w:r>
@@ -1698,6 +2369,37 @@
       <w:suppressAutoHyphens/>
     </w:pPr>
   </w:style>
+  <w:style w:type="paragraph" w:styleId="Ttulo5">
+    <w:name w:val="heading 5"/>
+    <w:basedOn w:val="Normal"/>
+    <w:next w:val="Normal"/>
+    <w:link w:val="Ttulo5Car"/>
+    <w:uiPriority w:val="9"/>
+    <w:unhideWhenUsed/>
+    <w:qFormat/>
+    <w:rsid w:val="0010728C"/>
+    <w:pPr>
+      <w:keepNext/>
+      <w:widowControl/>
+      <w:suppressAutoHyphens w:val="0"/>
+      <w:autoSpaceDN/>
+      <w:ind w:left="1008" w:hanging="1008"/>
+      <w:jc w:val="center"/>
+      <w:textAlignment w:val="auto"/>
+      <w:outlineLvl w:val="4"/>
+    </w:pPr>
+    <w:rPr>
+      <w:rFonts w:ascii="Arial Rounded" w:eastAsia="Arial Rounded" w:hAnsi="Arial Rounded" w:cs="Arial Rounded"/>
+      <w:b/>
+      <w:bCs/>
+      <w:i/>
+      <w:iCs/>
+      <w:kern w:val="0"/>
+      <w:sz w:val="18"/>
+      <w:szCs w:val="18"/>
+      <w:lang w:val="es" w:eastAsia="es-SV" w:bidi="ar-SA"/>
+    </w:rPr>
+  </w:style>
   <w:style w:type="character" w:default="1" w:styleId="Fuentedeprrafopredeter">
     <w:name w:val="Default Paragraph Font"/>
     <w:uiPriority w:val="1"/>
@@ -1826,6 +2528,24 @@
         <w:insideV w:val="single" w:sz="4" w:space="0" w:color="auto"/>
       </w:tblBorders>
     </w:tblPr>
+  </w:style>
+  <w:style w:type="character" w:customStyle="1" w:styleId="Ttulo5Car">
+    <w:name w:val="Título 5 Car"/>
+    <w:basedOn w:val="Fuentedeprrafopredeter"/>
+    <w:link w:val="Ttulo5"/>
+    <w:uiPriority w:val="9"/>
+    <w:rsid w:val="0010728C"/>
+    <w:rPr>
+      <w:rFonts w:ascii="Arial Rounded" w:eastAsia="Arial Rounded" w:hAnsi="Arial Rounded" w:cs="Arial Rounded"/>
+      <w:b/>
+      <w:bCs/>
+      <w:i/>
+      <w:iCs/>
+      <w:kern w:val="0"/>
+      <w:sz w:val="18"/>
+      <w:szCs w:val="18"/>
+      <w:lang w:val="es" w:eastAsia="es-SV" w:bidi="ar-SA"/>
+    </w:rPr>
   </w:style>
 </w:styles>
 </file>

</xml_diff>

<commit_message>
Se corrige la seccion de sedes y oficinas con el nuevo formato.
</commit_message>
<xml_diff>
--- a/backend/plantilla_transporte.docx
+++ b/backend/plantilla_transporte.docx
@@ -1905,13 +1905,1140 @@
           <w:szCs w:val="22"/>
         </w:rPr>
       </w:pPr>
-      <w:r>
-        <w:rPr>
-          <w:sz w:val="22"/>
-          <w:szCs w:val="22"/>
-        </w:rPr>
-        <w:t xml:space="preserve">Observaciones:_______________________________________________________________________________________________________________________________________________________________________________________________ </w:t>
-      </w:r>
+      <w:proofErr w:type="gramStart"/>
+      <w:r>
+        <w:rPr>
+          <w:sz w:val="22"/>
+          <w:szCs w:val="22"/>
+        </w:rPr>
+        <w:t>Observaciones:_</w:t>
+      </w:r>
+      <w:proofErr w:type="gramEnd"/>
+      <w:r>
+        <w:rPr>
+          <w:sz w:val="22"/>
+          <w:szCs w:val="22"/>
+        </w:rPr>
+        <w:t xml:space="preserve">______________________________________________________________________________________________________________________________________________________________________________________________ </w:t>
+      </w:r>
+    </w:p>
+    <w:p>
+      <w:pPr>
+        <w:suppressAutoHyphens w:val="0"/>
+        <w:rPr>
+          <w:sz w:val="22"/>
+          <w:szCs w:val="22"/>
+        </w:rPr>
+      </w:pPr>
+      <w:r>
+        <w:rPr>
+          <w:sz w:val="22"/>
+          <w:szCs w:val="22"/>
+        </w:rPr>
+        <w:br w:type="page"/>
+      </w:r>
+    </w:p>
+    <w:p>
+      <w:pPr>
+        <w:tabs>
+          <w:tab w:val="left" w:pos="3915"/>
+        </w:tabs>
+        <w:spacing w:line="360" w:lineRule="auto"/>
+        <w:rPr>
+          <w:rFonts w:ascii="Museo Sans 300" w:eastAsia="Museo Sans 300" w:hAnsi="Museo Sans 300" w:cs="Museo Sans 300"/>
+          <w:sz w:val="20"/>
+          <w:szCs w:val="20"/>
+        </w:rPr>
+      </w:pPr>
+    </w:p>
+    <w:p>
+      <w:pPr>
+        <w:tabs>
+          <w:tab w:val="left" w:pos="3915"/>
+        </w:tabs>
+        <w:spacing w:line="360" w:lineRule="auto"/>
+        <w:rPr>
+          <w:rFonts w:ascii="Museo Sans 300" w:eastAsia="Museo Sans 300" w:hAnsi="Museo Sans 300" w:cs="Museo Sans 300"/>
+          <w:sz w:val="20"/>
+          <w:szCs w:val="20"/>
+        </w:rPr>
+      </w:pPr>
+    </w:p>
+    <w:p>
+      <w:pPr>
+        <w:tabs>
+          <w:tab w:val="left" w:pos="3915"/>
+        </w:tabs>
+        <w:spacing w:line="360" w:lineRule="auto"/>
+        <w:rPr>
+          <w:rFonts w:ascii="Museo Sans 300" w:eastAsia="Museo Sans 300" w:hAnsi="Museo Sans 300" w:cs="Museo Sans 300"/>
+          <w:sz w:val="20"/>
+          <w:szCs w:val="20"/>
+        </w:rPr>
+      </w:pPr>
+    </w:p>
+    <w:p>
+      <w:pPr>
+        <w:tabs>
+          <w:tab w:val="left" w:pos="3915"/>
+        </w:tabs>
+        <w:spacing w:line="360" w:lineRule="auto"/>
+        <w:rPr>
+          <w:rFonts w:ascii="Museo Sans 300" w:eastAsia="Museo Sans 300" w:hAnsi="Museo Sans 300" w:cs="Museo Sans 300"/>
+          <w:sz w:val="20"/>
+          <w:szCs w:val="20"/>
+        </w:rPr>
+      </w:pPr>
+    </w:p>
+    <w:p>
+      <w:pPr>
+        <w:tabs>
+          <w:tab w:val="left" w:pos="3915"/>
+        </w:tabs>
+        <w:spacing w:line="360" w:lineRule="auto"/>
+        <w:rPr>
+          <w:rFonts w:ascii="Museo Sans 300" w:eastAsia="Museo Sans 300" w:hAnsi="Museo Sans 300" w:cs="Museo Sans 300"/>
+          <w:sz w:val="20"/>
+          <w:szCs w:val="20"/>
+        </w:rPr>
+      </w:pPr>
+    </w:p>
+    <w:p>
+      <w:pPr>
+        <w:tabs>
+          <w:tab w:val="left" w:pos="3915"/>
+        </w:tabs>
+        <w:spacing w:line="360" w:lineRule="auto"/>
+        <w:rPr>
+          <w:rFonts w:ascii="Museo Sans 300" w:eastAsia="Museo Sans 300" w:hAnsi="Museo Sans 300" w:cs="Museo Sans 300"/>
+          <w:sz w:val="20"/>
+          <w:szCs w:val="20"/>
+        </w:rPr>
+      </w:pPr>
+      <w:r>
+        <w:rPr>
+          <w:rFonts w:ascii="Museo Sans 300" w:eastAsia="Museo Sans 300" w:hAnsi="Museo Sans 300" w:cs="Museo Sans 300"/>
+          <w:sz w:val="20"/>
+          <w:szCs w:val="20"/>
+        </w:rPr>
+        <w:tab/>
+      </w:r>
+      <w:r>
+        <w:rPr>
+          <w:noProof/>
+        </w:rPr>
+        <mc:AlternateContent>
+          <mc:Choice Requires="wps">
+            <w:drawing>
+              <wp:anchor distT="4294967294" distB="4294967294" distL="114300" distR="114300" simplePos="0" relativeHeight="251672576" behindDoc="0" locked="0" layoutInCell="1" hidden="0" allowOverlap="1" wp14:anchorId="5DE21BAE" wp14:editId="464CD84C">
+                <wp:simplePos x="0" y="0"/>
+                <wp:positionH relativeFrom="column">
+                  <wp:posOffset>1</wp:posOffset>
+                </wp:positionH>
+                <wp:positionV relativeFrom="paragraph">
+                  <wp:posOffset>278765</wp:posOffset>
+                </wp:positionV>
+                <wp:extent cx="2524125" cy="12700"/>
+                <wp:effectExtent l="0" t="0" r="0" b="0"/>
+                <wp:wrapNone/>
+                <wp:docPr id="5" name="Conector recto de flecha 5"/>
+                <wp:cNvGraphicFramePr/>
+                <a:graphic xmlns:a="http://schemas.openxmlformats.org/drawingml/2006/main">
+                  <a:graphicData uri="http://schemas.microsoft.com/office/word/2010/wordprocessingShape">
+                    <wps:wsp>
+                      <wps:cNvCnPr/>
+                      <wps:spPr>
+                        <a:xfrm>
+                          <a:off x="4083938" y="3780000"/>
+                          <a:ext cx="2524125" cy="0"/>
+                        </a:xfrm>
+                        <a:prstGeom prst="straightConnector1">
+                          <a:avLst/>
+                        </a:prstGeom>
+                        <a:noFill/>
+                        <a:ln w="9525" cap="flat" cmpd="sng">
+                          <a:solidFill>
+                            <a:schemeClr val="dk1"/>
+                          </a:solidFill>
+                          <a:prstDash val="solid"/>
+                          <a:round/>
+                          <a:headEnd type="none" w="sm" len="sm"/>
+                          <a:tailEnd type="none" w="sm" len="sm"/>
+                        </a:ln>
+                      </wps:spPr>
+                      <wps:bodyPr/>
+                    </wps:wsp>
+                  </a:graphicData>
+                </a:graphic>
+              </wp:anchor>
+            </w:drawing>
+          </mc:Choice>
+          <mc:Fallback>
+            <w:pict>
+              <v:shapetype w14:anchorId="024BE6A0" id="_x0000_t32" coordsize="21600,21600" o:spt="32" o:oned="t" path="m,l21600,21600e" filled="f">
+                <v:path arrowok="t" fillok="f" o:connecttype="none"/>
+                <o:lock v:ext="edit" shapetype="t"/>
+              </v:shapetype>
+              <v:shape id="Conector recto de flecha 5" o:spid="_x0000_s1026" type="#_x0000_t32" style="position:absolute;margin-left:0;margin-top:21.95pt;width:198.75pt;height:1pt;z-index:251672576;visibility:visible;mso-wrap-style:square;mso-wrap-distance-left:9pt;mso-wrap-distance-top:-6e-5mm;mso-wrap-distance-right:9pt;mso-wrap-distance-bottom:-6e-5mm;mso-position-horizontal:absolute;mso-position-horizontal-relative:text;mso-position-vertical:absolute;mso-position-vertical-relative:text" o:gfxdata="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" strokecolor="black [3200]">
+                <v:stroke startarrowwidth="narrow" startarrowlength="short" endarrowwidth="narrow" endarrowlength="short"/>
+              </v:shape>
+            </w:pict>
+          </mc:Fallback>
+        </mc:AlternateContent>
+      </w:r>
+      <w:r>
+        <w:rPr>
+          <w:noProof/>
+        </w:rPr>
+        <mc:AlternateContent>
+          <mc:Choice Requires="wps">
+            <w:drawing>
+              <wp:anchor distT="4294967294" distB="4294967294" distL="114300" distR="114300" simplePos="0" relativeHeight="251673600" behindDoc="0" locked="0" layoutInCell="1" hidden="0" allowOverlap="1" wp14:anchorId="0D12BFA4" wp14:editId="234EBCDD">
+                <wp:simplePos x="0" y="0"/>
+                <wp:positionH relativeFrom="column">
+                  <wp:posOffset>3499485</wp:posOffset>
+                </wp:positionH>
+                <wp:positionV relativeFrom="paragraph">
+                  <wp:posOffset>275590</wp:posOffset>
+                </wp:positionV>
+                <wp:extent cx="2524125" cy="12700"/>
+                <wp:effectExtent l="0" t="0" r="0" b="0"/>
+                <wp:wrapNone/>
+                <wp:docPr id="7" name="Conector recto de flecha 7"/>
+                <wp:cNvGraphicFramePr/>
+                <a:graphic xmlns:a="http://schemas.openxmlformats.org/drawingml/2006/main">
+                  <a:graphicData uri="http://schemas.microsoft.com/office/word/2010/wordprocessingShape">
+                    <wps:wsp>
+                      <wps:cNvCnPr/>
+                      <wps:spPr>
+                        <a:xfrm>
+                          <a:off x="4083938" y="3780000"/>
+                          <a:ext cx="2524125" cy="0"/>
+                        </a:xfrm>
+                        <a:prstGeom prst="straightConnector1">
+                          <a:avLst/>
+                        </a:prstGeom>
+                        <a:noFill/>
+                        <a:ln w="9525" cap="flat" cmpd="sng">
+                          <a:solidFill>
+                            <a:schemeClr val="dk1"/>
+                          </a:solidFill>
+                          <a:prstDash val="solid"/>
+                          <a:round/>
+                          <a:headEnd type="none" w="sm" len="sm"/>
+                          <a:tailEnd type="none" w="sm" len="sm"/>
+                        </a:ln>
+                      </wps:spPr>
+                      <wps:bodyPr/>
+                    </wps:wsp>
+                  </a:graphicData>
+                </a:graphic>
+              </wp:anchor>
+            </w:drawing>
+          </mc:Choice>
+          <mc:Fallback>
+            <w:pict>
+              <v:shape w14:anchorId="2D02C33A" id="Conector recto de flecha 7" o:spid="_x0000_s1026" type="#_x0000_t32" style="position:absolute;margin-left:275.55pt;margin-top:21.7pt;width:198.75pt;height:1pt;z-index:251673600;visibility:visible;mso-wrap-style:square;mso-wrap-distance-left:9pt;mso-wrap-distance-top:-6e-5mm;mso-wrap-distance-right:9pt;mso-wrap-distance-bottom:-6e-5mm;mso-position-horizontal:absolute;mso-position-horizontal-relative:text;mso-position-vertical:absolute;mso-position-vertical-relative:text" o:gfxdata="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" strokecolor="black [3200]">
+                <v:stroke startarrowwidth="narrow" startarrowlength="short" endarrowwidth="narrow" endarrowlength="short"/>
+              </v:shape>
+            </w:pict>
+          </mc:Fallback>
+        </mc:AlternateContent>
+      </w:r>
+    </w:p>
+    <w:p>
+      <w:pPr>
+        <w:rPr>
+          <w:rFonts w:ascii="Museo Sans 300" w:eastAsia="Museo Sans 300" w:hAnsi="Museo Sans 300" w:cs="Museo Sans 300"/>
+          <w:sz w:val="20"/>
+          <w:szCs w:val="20"/>
+        </w:rPr>
+      </w:pPr>
+    </w:p>
+    <w:p>
+      <w:pPr>
+        <w:rPr>
+          <w:rFonts w:ascii="Museo Sans 300" w:eastAsia="Museo Sans 300" w:hAnsi="Museo Sans 300" w:cs="Museo Sans 300"/>
+          <w:sz w:val="20"/>
+          <w:szCs w:val="20"/>
+        </w:rPr>
+      </w:pPr>
+      <w:r>
+        <w:rPr>
+          <w:rFonts w:ascii="Museo Sans 300" w:eastAsia="Museo Sans 300" w:hAnsi="Museo Sans 300" w:cs="Museo Sans 300"/>
+          <w:sz w:val="20"/>
+          <w:szCs w:val="20"/>
+        </w:rPr>
+        <w:t xml:space="preserve">Nombre, firma, fecha y sello de representante </w:t>
+      </w:r>
+      <w:r>
+        <w:rPr>
+          <w:rFonts w:ascii="Museo Sans 300" w:eastAsia="Museo Sans 300" w:hAnsi="Museo Sans 300" w:cs="Museo Sans 300"/>
+          <w:sz w:val="20"/>
+          <w:szCs w:val="20"/>
+        </w:rPr>
+        <w:tab/>
+      </w:r>
+      <w:r>
+        <w:rPr>
+          <w:rFonts w:ascii="Museo Sans 300" w:eastAsia="Museo Sans 300" w:hAnsi="Museo Sans 300" w:cs="Museo Sans 300"/>
+          <w:sz w:val="20"/>
+          <w:szCs w:val="20"/>
+        </w:rPr>
+        <w:tab/>
+        <w:t xml:space="preserve">             Nombre, firma, fecha y sello de representante </w:t>
+      </w:r>
+    </w:p>
+    <w:p>
+      <w:pPr>
+        <w:rPr>
+          <w:rFonts w:ascii="Museo Sans 300" w:eastAsia="Museo Sans 300" w:hAnsi="Museo Sans 300" w:cs="Museo Sans 300"/>
+          <w:sz w:val="20"/>
+          <w:szCs w:val="20"/>
+        </w:rPr>
+      </w:pPr>
+      <w:r>
+        <w:rPr>
+          <w:rFonts w:ascii="Museo Sans 300" w:eastAsia="Museo Sans 300" w:hAnsi="Museo Sans 300" w:cs="Museo Sans 300"/>
+          <w:sz w:val="20"/>
+          <w:szCs w:val="20"/>
+        </w:rPr>
+        <w:t>de ubicación</w:t>
+      </w:r>
+      <w:r>
+        <w:rPr>
+          <w:rFonts w:ascii="Museo Sans 300" w:eastAsia="Museo Sans 300" w:hAnsi="Museo Sans 300" w:cs="Museo Sans 300"/>
+          <w:sz w:val="20"/>
+          <w:szCs w:val="20"/>
+        </w:rPr>
+        <w:tab/>
+      </w:r>
+      <w:r>
+        <w:rPr>
+          <w:rFonts w:ascii="Museo Sans 300" w:eastAsia="Museo Sans 300" w:hAnsi="Museo Sans 300" w:cs="Museo Sans 300"/>
+          <w:sz w:val="20"/>
+          <w:szCs w:val="20"/>
+        </w:rPr>
+        <w:tab/>
+      </w:r>
+      <w:r>
+        <w:rPr>
+          <w:rFonts w:ascii="Museo Sans 300" w:eastAsia="Museo Sans 300" w:hAnsi="Museo Sans 300" w:cs="Museo Sans 300"/>
+          <w:sz w:val="20"/>
+          <w:szCs w:val="20"/>
+        </w:rPr>
+        <w:tab/>
+      </w:r>
+      <w:r>
+        <w:rPr>
+          <w:rFonts w:ascii="Museo Sans 300" w:eastAsia="Museo Sans 300" w:hAnsi="Museo Sans 300" w:cs="Museo Sans 300"/>
+          <w:sz w:val="20"/>
+          <w:szCs w:val="20"/>
+        </w:rPr>
+        <w:tab/>
+      </w:r>
+      <w:r>
+        <w:rPr>
+          <w:rFonts w:ascii="Museo Sans 300" w:eastAsia="Museo Sans 300" w:hAnsi="Museo Sans 300" w:cs="Museo Sans 300"/>
+          <w:sz w:val="20"/>
+          <w:szCs w:val="20"/>
+        </w:rPr>
+        <w:tab/>
+      </w:r>
+      <w:r>
+        <w:rPr>
+          <w:rFonts w:ascii="Museo Sans 300" w:eastAsia="Museo Sans 300" w:hAnsi="Museo Sans 300" w:cs="Museo Sans 300"/>
+          <w:sz w:val="20"/>
+          <w:szCs w:val="20"/>
+        </w:rPr>
+        <w:tab/>
+        <w:t xml:space="preserve">            de ubicación</w:t>
+      </w:r>
+    </w:p>
+    <w:p>
+      <w:pPr>
+        <w:spacing w:line="360" w:lineRule="auto"/>
+        <w:rPr>
+          <w:rFonts w:ascii="Museo Sans 300" w:eastAsia="Museo Sans 300" w:hAnsi="Museo Sans 300" w:cs="Museo Sans 300"/>
+          <w:sz w:val="20"/>
+          <w:szCs w:val="20"/>
+        </w:rPr>
+      </w:pPr>
+    </w:p>
+    <w:p>
+      <w:pPr>
+        <w:tabs>
+          <w:tab w:val="left" w:pos="3360"/>
+        </w:tabs>
+        <w:spacing w:line="360" w:lineRule="auto"/>
+        <w:rPr>
+          <w:rFonts w:ascii="Museo Sans 300" w:eastAsia="Museo Sans 300" w:hAnsi="Museo Sans 300" w:cs="Museo Sans 300"/>
+          <w:sz w:val="20"/>
+          <w:szCs w:val="20"/>
+        </w:rPr>
+      </w:pPr>
+      <w:r>
+        <w:rPr>
+          <w:rFonts w:ascii="Museo Sans 300" w:eastAsia="Museo Sans 300" w:hAnsi="Museo Sans 300" w:cs="Museo Sans 300"/>
+          <w:sz w:val="20"/>
+          <w:szCs w:val="20"/>
+        </w:rPr>
+        <w:tab/>
+      </w:r>
+    </w:p>
+    <w:p>
+      <w:pPr>
+        <w:spacing w:line="360" w:lineRule="auto"/>
+        <w:rPr>
+          <w:rFonts w:ascii="Museo Sans 300" w:eastAsia="Museo Sans 300" w:hAnsi="Museo Sans 300" w:cs="Museo Sans 300"/>
+          <w:sz w:val="20"/>
+          <w:szCs w:val="20"/>
+        </w:rPr>
+      </w:pPr>
+    </w:p>
+    <w:p>
+      <w:pPr>
+        <w:spacing w:line="360" w:lineRule="auto"/>
+        <w:rPr>
+          <w:rFonts w:ascii="Museo Sans 300" w:eastAsia="Museo Sans 300" w:hAnsi="Museo Sans 300" w:cs="Museo Sans 300"/>
+          <w:sz w:val="20"/>
+          <w:szCs w:val="20"/>
+        </w:rPr>
+      </w:pPr>
+    </w:p>
+    <w:p>
+      <w:pPr>
+        <w:spacing w:line="360" w:lineRule="auto"/>
+        <w:jc w:val="center"/>
+        <w:rPr>
+          <w:rFonts w:ascii="Museo Sans 300" w:eastAsia="Museo Sans 300" w:hAnsi="Museo Sans 300" w:cs="Museo Sans 300"/>
+          <w:sz w:val="20"/>
+          <w:szCs w:val="20"/>
+        </w:rPr>
+      </w:pPr>
+    </w:p>
+    <w:p>
+      <w:pPr>
+        <w:spacing w:line="360" w:lineRule="auto"/>
+        <w:rPr>
+          <w:rFonts w:ascii="Museo Sans 300" w:eastAsia="Museo Sans 300" w:hAnsi="Museo Sans 300" w:cs="Museo Sans 300"/>
+          <w:sz w:val="20"/>
+          <w:szCs w:val="20"/>
+        </w:rPr>
+      </w:pPr>
+    </w:p>
+    <w:p>
+      <w:pPr>
+        <w:tabs>
+          <w:tab w:val="left" w:pos="3915"/>
+        </w:tabs>
+        <w:spacing w:line="360" w:lineRule="auto"/>
+        <w:rPr>
+          <w:rFonts w:ascii="Museo Sans 300" w:eastAsia="Museo Sans 300" w:hAnsi="Museo Sans 300" w:cs="Museo Sans 300"/>
+          <w:sz w:val="20"/>
+          <w:szCs w:val="20"/>
+        </w:rPr>
+      </w:pPr>
+    </w:p>
+    <w:p>
+      <w:pPr>
+        <w:tabs>
+          <w:tab w:val="left" w:pos="3915"/>
+        </w:tabs>
+        <w:spacing w:line="360" w:lineRule="auto"/>
+        <w:rPr>
+          <w:rFonts w:ascii="Museo Sans 300" w:eastAsia="Museo Sans 300" w:hAnsi="Museo Sans 300" w:cs="Museo Sans 300"/>
+          <w:sz w:val="20"/>
+          <w:szCs w:val="20"/>
+        </w:rPr>
+      </w:pPr>
+    </w:p>
+    <w:p>
+      <w:pPr>
+        <w:tabs>
+          <w:tab w:val="left" w:pos="3915"/>
+        </w:tabs>
+        <w:spacing w:line="360" w:lineRule="auto"/>
+        <w:rPr>
+          <w:rFonts w:ascii="Museo Sans 300" w:eastAsia="Museo Sans 300" w:hAnsi="Museo Sans 300" w:cs="Museo Sans 300"/>
+          <w:sz w:val="20"/>
+          <w:szCs w:val="20"/>
+        </w:rPr>
+      </w:pPr>
+    </w:p>
+    <w:p>
+      <w:pPr>
+        <w:tabs>
+          <w:tab w:val="left" w:pos="3915"/>
+        </w:tabs>
+        <w:spacing w:line="360" w:lineRule="auto"/>
+        <w:rPr>
+          <w:rFonts w:ascii="Museo Sans 300" w:eastAsia="Museo Sans 300" w:hAnsi="Museo Sans 300" w:cs="Museo Sans 300"/>
+          <w:sz w:val="20"/>
+          <w:szCs w:val="20"/>
+        </w:rPr>
+      </w:pPr>
+    </w:p>
+    <w:p>
+      <w:pPr>
+        <w:tabs>
+          <w:tab w:val="left" w:pos="3915"/>
+        </w:tabs>
+        <w:spacing w:line="360" w:lineRule="auto"/>
+        <w:rPr>
+          <w:rFonts w:ascii="Museo Sans 300" w:eastAsia="Museo Sans 300" w:hAnsi="Museo Sans 300" w:cs="Museo Sans 300"/>
+          <w:sz w:val="20"/>
+          <w:szCs w:val="20"/>
+        </w:rPr>
+      </w:pPr>
+      <w:r>
+        <w:rPr>
+          <w:rFonts w:ascii="Museo Sans 300" w:eastAsia="Museo Sans 300" w:hAnsi="Museo Sans 300" w:cs="Museo Sans 300"/>
+          <w:sz w:val="20"/>
+          <w:szCs w:val="20"/>
+        </w:rPr>
+        <w:tab/>
+      </w:r>
+      <w:r>
+        <w:rPr>
+          <w:noProof/>
+        </w:rPr>
+        <mc:AlternateContent>
+          <mc:Choice Requires="wps">
+            <w:drawing>
+              <wp:anchor distT="4294967294" distB="4294967294" distL="114300" distR="114300" simplePos="0" relativeHeight="251674624" behindDoc="0" locked="0" layoutInCell="1" hidden="0" allowOverlap="1" wp14:anchorId="1EB02C4D" wp14:editId="67A03A6C">
+                <wp:simplePos x="0" y="0"/>
+                <wp:positionH relativeFrom="column">
+                  <wp:posOffset>1</wp:posOffset>
+                </wp:positionH>
+                <wp:positionV relativeFrom="paragraph">
+                  <wp:posOffset>278765</wp:posOffset>
+                </wp:positionV>
+                <wp:extent cx="2524125" cy="12700"/>
+                <wp:effectExtent l="0" t="0" r="0" b="0"/>
+                <wp:wrapNone/>
+                <wp:docPr id="8" name="Conector recto de flecha 8"/>
+                <wp:cNvGraphicFramePr/>
+                <a:graphic xmlns:a="http://schemas.openxmlformats.org/drawingml/2006/main">
+                  <a:graphicData uri="http://schemas.microsoft.com/office/word/2010/wordprocessingShape">
+                    <wps:wsp>
+                      <wps:cNvCnPr/>
+                      <wps:spPr>
+                        <a:xfrm>
+                          <a:off x="4083938" y="3780000"/>
+                          <a:ext cx="2524125" cy="0"/>
+                        </a:xfrm>
+                        <a:prstGeom prst="straightConnector1">
+                          <a:avLst/>
+                        </a:prstGeom>
+                        <a:noFill/>
+                        <a:ln w="9525" cap="flat" cmpd="sng">
+                          <a:solidFill>
+                            <a:schemeClr val="dk1"/>
+                          </a:solidFill>
+                          <a:prstDash val="solid"/>
+                          <a:round/>
+                          <a:headEnd type="none" w="sm" len="sm"/>
+                          <a:tailEnd type="none" w="sm" len="sm"/>
+                        </a:ln>
+                      </wps:spPr>
+                      <wps:bodyPr/>
+                    </wps:wsp>
+                  </a:graphicData>
+                </a:graphic>
+              </wp:anchor>
+            </w:drawing>
+          </mc:Choice>
+          <mc:Fallback>
+            <w:pict>
+              <v:shape w14:anchorId="13218F00" id="Conector recto de flecha 8" o:spid="_x0000_s1026" type="#_x0000_t32" style="position:absolute;margin-left:0;margin-top:21.95pt;width:198.75pt;height:1pt;z-index:251674624;visibility:visible;mso-wrap-style:square;mso-wrap-distance-left:9pt;mso-wrap-distance-top:-6e-5mm;mso-wrap-distance-right:9pt;mso-wrap-distance-bottom:-6e-5mm;mso-position-horizontal:absolute;mso-position-horizontal-relative:text;mso-position-vertical:absolute;mso-position-vertical-relative:text" o:gfxdata="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" strokecolor="black [3200]">
+                <v:stroke startarrowwidth="narrow" startarrowlength="short" endarrowwidth="narrow" endarrowlength="short"/>
+              </v:shape>
+            </w:pict>
+          </mc:Fallback>
+        </mc:AlternateContent>
+      </w:r>
+      <w:r>
+        <w:rPr>
+          <w:noProof/>
+        </w:rPr>
+        <mc:AlternateContent>
+          <mc:Choice Requires="wps">
+            <w:drawing>
+              <wp:anchor distT="4294967294" distB="4294967294" distL="114300" distR="114300" simplePos="0" relativeHeight="251675648" behindDoc="0" locked="0" layoutInCell="1" hidden="0" allowOverlap="1" wp14:anchorId="08EE20C6" wp14:editId="326BEFBF">
+                <wp:simplePos x="0" y="0"/>
+                <wp:positionH relativeFrom="column">
+                  <wp:posOffset>3499485</wp:posOffset>
+                </wp:positionH>
+                <wp:positionV relativeFrom="paragraph">
+                  <wp:posOffset>275590</wp:posOffset>
+                </wp:positionV>
+                <wp:extent cx="2524125" cy="12700"/>
+                <wp:effectExtent l="0" t="0" r="0" b="0"/>
+                <wp:wrapNone/>
+                <wp:docPr id="3" name="Conector recto de flecha 3"/>
+                <wp:cNvGraphicFramePr/>
+                <a:graphic xmlns:a="http://schemas.openxmlformats.org/drawingml/2006/main">
+                  <a:graphicData uri="http://schemas.microsoft.com/office/word/2010/wordprocessingShape">
+                    <wps:wsp>
+                      <wps:cNvCnPr/>
+                      <wps:spPr>
+                        <a:xfrm>
+                          <a:off x="4083938" y="3780000"/>
+                          <a:ext cx="2524125" cy="0"/>
+                        </a:xfrm>
+                        <a:prstGeom prst="straightConnector1">
+                          <a:avLst/>
+                        </a:prstGeom>
+                        <a:noFill/>
+                        <a:ln w="9525" cap="flat" cmpd="sng">
+                          <a:solidFill>
+                            <a:schemeClr val="dk1"/>
+                          </a:solidFill>
+                          <a:prstDash val="solid"/>
+                          <a:round/>
+                          <a:headEnd type="none" w="sm" len="sm"/>
+                          <a:tailEnd type="none" w="sm" len="sm"/>
+                        </a:ln>
+                      </wps:spPr>
+                      <wps:bodyPr/>
+                    </wps:wsp>
+                  </a:graphicData>
+                </a:graphic>
+              </wp:anchor>
+            </w:drawing>
+          </mc:Choice>
+          <mc:Fallback>
+            <w:pict>
+              <v:shape w14:anchorId="7F97901B" id="Conector recto de flecha 3" o:spid="_x0000_s1026" type="#_x0000_t32" style="position:absolute;margin-left:275.55pt;margin-top:21.7pt;width:198.75pt;height:1pt;z-index:251675648;visibility:visible;mso-wrap-style:square;mso-wrap-distance-left:9pt;mso-wrap-distance-top:-6e-5mm;mso-wrap-distance-right:9pt;mso-wrap-distance-bottom:-6e-5mm;mso-position-horizontal:absolute;mso-position-horizontal-relative:text;mso-position-vertical:absolute;mso-position-vertical-relative:text" o:gfxdata="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" strokecolor="black [3200]">
+                <v:stroke startarrowwidth="narrow" startarrowlength="short" endarrowwidth="narrow" endarrowlength="short"/>
+              </v:shape>
+            </w:pict>
+          </mc:Fallback>
+        </mc:AlternateContent>
+      </w:r>
+    </w:p>
+    <w:p>
+      <w:pPr>
+        <w:rPr>
+          <w:rFonts w:ascii="Museo Sans 300" w:eastAsia="Museo Sans 300" w:hAnsi="Museo Sans 300" w:cs="Museo Sans 300"/>
+          <w:sz w:val="20"/>
+          <w:szCs w:val="20"/>
+        </w:rPr>
+      </w:pPr>
+    </w:p>
+    <w:p>
+      <w:pPr>
+        <w:rPr>
+          <w:rFonts w:ascii="Museo Sans 300" w:eastAsia="Museo Sans 300" w:hAnsi="Museo Sans 300" w:cs="Museo Sans 300"/>
+          <w:sz w:val="20"/>
+          <w:szCs w:val="20"/>
+        </w:rPr>
+      </w:pPr>
+      <w:r>
+        <w:rPr>
+          <w:rFonts w:ascii="Museo Sans 300" w:eastAsia="Museo Sans 300" w:hAnsi="Museo Sans 300" w:cs="Museo Sans 300"/>
+          <w:sz w:val="20"/>
+          <w:szCs w:val="20"/>
+        </w:rPr>
+        <w:t xml:space="preserve">Nombre, firma, fecha y sello de representante </w:t>
+      </w:r>
+      <w:r>
+        <w:rPr>
+          <w:rFonts w:ascii="Museo Sans 300" w:eastAsia="Museo Sans 300" w:hAnsi="Museo Sans 300" w:cs="Museo Sans 300"/>
+          <w:sz w:val="20"/>
+          <w:szCs w:val="20"/>
+        </w:rPr>
+        <w:tab/>
+      </w:r>
+      <w:r>
+        <w:rPr>
+          <w:rFonts w:ascii="Museo Sans 300" w:eastAsia="Museo Sans 300" w:hAnsi="Museo Sans 300" w:cs="Museo Sans 300"/>
+          <w:sz w:val="20"/>
+          <w:szCs w:val="20"/>
+        </w:rPr>
+        <w:tab/>
+        <w:t xml:space="preserve">             Nombre, firma, fecha y sello de representante </w:t>
+      </w:r>
+    </w:p>
+    <w:p>
+      <w:pPr>
+        <w:rPr>
+          <w:rFonts w:ascii="Museo Sans 300" w:eastAsia="Museo Sans 300" w:hAnsi="Museo Sans 300" w:cs="Museo Sans 300"/>
+          <w:sz w:val="20"/>
+          <w:szCs w:val="20"/>
+        </w:rPr>
+      </w:pPr>
+      <w:r>
+        <w:rPr>
+          <w:rFonts w:ascii="Museo Sans 300" w:eastAsia="Museo Sans 300" w:hAnsi="Museo Sans 300" w:cs="Museo Sans 300"/>
+          <w:sz w:val="20"/>
+          <w:szCs w:val="20"/>
+        </w:rPr>
+        <w:t>de ubicación</w:t>
+      </w:r>
+      <w:r>
+        <w:rPr>
+          <w:rFonts w:ascii="Museo Sans 300" w:eastAsia="Museo Sans 300" w:hAnsi="Museo Sans 300" w:cs="Museo Sans 300"/>
+          <w:sz w:val="20"/>
+          <w:szCs w:val="20"/>
+        </w:rPr>
+        <w:tab/>
+      </w:r>
+      <w:r>
+        <w:rPr>
+          <w:rFonts w:ascii="Museo Sans 300" w:eastAsia="Museo Sans 300" w:hAnsi="Museo Sans 300" w:cs="Museo Sans 300"/>
+          <w:sz w:val="20"/>
+          <w:szCs w:val="20"/>
+        </w:rPr>
+        <w:tab/>
+      </w:r>
+      <w:r>
+        <w:rPr>
+          <w:rFonts w:ascii="Museo Sans 300" w:eastAsia="Museo Sans 300" w:hAnsi="Museo Sans 300" w:cs="Museo Sans 300"/>
+          <w:sz w:val="20"/>
+          <w:szCs w:val="20"/>
+        </w:rPr>
+        <w:tab/>
+      </w:r>
+      <w:r>
+        <w:rPr>
+          <w:rFonts w:ascii="Museo Sans 300" w:eastAsia="Museo Sans 300" w:hAnsi="Museo Sans 300" w:cs="Museo Sans 300"/>
+          <w:sz w:val="20"/>
+          <w:szCs w:val="20"/>
+        </w:rPr>
+        <w:tab/>
+      </w:r>
+      <w:r>
+        <w:rPr>
+          <w:rFonts w:ascii="Museo Sans 300" w:eastAsia="Museo Sans 300" w:hAnsi="Museo Sans 300" w:cs="Museo Sans 300"/>
+          <w:sz w:val="20"/>
+          <w:szCs w:val="20"/>
+        </w:rPr>
+        <w:tab/>
+      </w:r>
+      <w:r>
+        <w:rPr>
+          <w:rFonts w:ascii="Museo Sans 300" w:eastAsia="Museo Sans 300" w:hAnsi="Museo Sans 300" w:cs="Museo Sans 300"/>
+          <w:sz w:val="20"/>
+          <w:szCs w:val="20"/>
+        </w:rPr>
+        <w:tab/>
+        <w:t xml:space="preserve">            de ubicación</w:t>
+      </w:r>
+    </w:p>
+    <w:p>
+      <w:pPr>
+        <w:spacing w:line="360" w:lineRule="auto"/>
+        <w:rPr>
+          <w:rFonts w:ascii="Museo Sans 300" w:eastAsia="Museo Sans 300" w:hAnsi="Museo Sans 300" w:cs="Museo Sans 300"/>
+          <w:sz w:val="20"/>
+          <w:szCs w:val="20"/>
+        </w:rPr>
+      </w:pPr>
+    </w:p>
+    <w:p>
+      <w:pPr>
+        <w:spacing w:line="360" w:lineRule="auto"/>
+        <w:rPr>
+          <w:rFonts w:ascii="Museo Sans 300" w:eastAsia="Museo Sans 300" w:hAnsi="Museo Sans 300" w:cs="Museo Sans 300"/>
+          <w:sz w:val="20"/>
+          <w:szCs w:val="20"/>
+        </w:rPr>
+      </w:pPr>
+    </w:p>
+    <w:p>
+      <w:pPr>
+        <w:spacing w:line="360" w:lineRule="auto"/>
+        <w:rPr>
+          <w:rFonts w:ascii="Museo Sans 300" w:eastAsia="Museo Sans 300" w:hAnsi="Museo Sans 300" w:cs="Museo Sans 300"/>
+          <w:sz w:val="20"/>
+          <w:szCs w:val="20"/>
+        </w:rPr>
+      </w:pPr>
+    </w:p>
+    <w:p>
+      <w:pPr>
+        <w:spacing w:line="360" w:lineRule="auto"/>
+        <w:rPr>
+          <w:rFonts w:ascii="Museo Sans 300" w:eastAsia="Museo Sans 300" w:hAnsi="Museo Sans 300" w:cs="Museo Sans 300"/>
+          <w:sz w:val="20"/>
+          <w:szCs w:val="20"/>
+        </w:rPr>
+      </w:pPr>
+    </w:p>
+    <w:p>
+      <w:pPr>
+        <w:tabs>
+          <w:tab w:val="left" w:pos="3915"/>
+        </w:tabs>
+        <w:spacing w:line="360" w:lineRule="auto"/>
+        <w:rPr>
+          <w:rFonts w:ascii="Museo Sans 300" w:eastAsia="Museo Sans 300" w:hAnsi="Museo Sans 300" w:cs="Museo Sans 300"/>
+          <w:sz w:val="20"/>
+          <w:szCs w:val="20"/>
+        </w:rPr>
+      </w:pPr>
+    </w:p>
+    <w:p>
+      <w:pPr>
+        <w:tabs>
+          <w:tab w:val="left" w:pos="3915"/>
+        </w:tabs>
+        <w:spacing w:line="360" w:lineRule="auto"/>
+        <w:rPr>
+          <w:rFonts w:ascii="Museo Sans 300" w:eastAsia="Museo Sans 300" w:hAnsi="Museo Sans 300" w:cs="Museo Sans 300"/>
+          <w:sz w:val="20"/>
+          <w:szCs w:val="20"/>
+        </w:rPr>
+      </w:pPr>
+    </w:p>
+    <w:p>
+      <w:pPr>
+        <w:tabs>
+          <w:tab w:val="left" w:pos="3915"/>
+        </w:tabs>
+        <w:spacing w:line="360" w:lineRule="auto"/>
+        <w:rPr>
+          <w:rFonts w:ascii="Museo Sans 300" w:eastAsia="Museo Sans 300" w:hAnsi="Museo Sans 300" w:cs="Museo Sans 300"/>
+          <w:sz w:val="20"/>
+          <w:szCs w:val="20"/>
+        </w:rPr>
+      </w:pPr>
+    </w:p>
+    <w:p>
+      <w:pPr>
+        <w:tabs>
+          <w:tab w:val="left" w:pos="3915"/>
+        </w:tabs>
+        <w:spacing w:line="360" w:lineRule="auto"/>
+        <w:rPr>
+          <w:rFonts w:ascii="Museo Sans 300" w:eastAsia="Museo Sans 300" w:hAnsi="Museo Sans 300" w:cs="Museo Sans 300"/>
+          <w:sz w:val="20"/>
+          <w:szCs w:val="20"/>
+        </w:rPr>
+      </w:pPr>
+    </w:p>
+    <w:p>
+      <w:pPr>
+        <w:tabs>
+          <w:tab w:val="left" w:pos="3915"/>
+        </w:tabs>
+        <w:spacing w:line="360" w:lineRule="auto"/>
+        <w:rPr>
+          <w:rFonts w:ascii="Museo Sans 300" w:eastAsia="Museo Sans 300" w:hAnsi="Museo Sans 300" w:cs="Museo Sans 300"/>
+          <w:sz w:val="20"/>
+          <w:szCs w:val="20"/>
+        </w:rPr>
+      </w:pPr>
+    </w:p>
+    <w:p>
+      <w:pPr>
+        <w:tabs>
+          <w:tab w:val="left" w:pos="3915"/>
+        </w:tabs>
+        <w:spacing w:line="360" w:lineRule="auto"/>
+        <w:rPr>
+          <w:rFonts w:ascii="Museo Sans 300" w:eastAsia="Museo Sans 300" w:hAnsi="Museo Sans 300" w:cs="Museo Sans 300"/>
+          <w:sz w:val="20"/>
+          <w:szCs w:val="20"/>
+        </w:rPr>
+      </w:pPr>
+    </w:p>
+    <w:p>
+      <w:pPr>
+        <w:tabs>
+          <w:tab w:val="left" w:pos="3915"/>
+        </w:tabs>
+        <w:spacing w:line="360" w:lineRule="auto"/>
+        <w:rPr>
+          <w:rFonts w:ascii="Museo Sans 300" w:eastAsia="Museo Sans 300" w:hAnsi="Museo Sans 300" w:cs="Museo Sans 300"/>
+          <w:sz w:val="20"/>
+          <w:szCs w:val="20"/>
+        </w:rPr>
+      </w:pPr>
+    </w:p>
+    <w:p>
+      <w:pPr>
+        <w:tabs>
+          <w:tab w:val="left" w:pos="3915"/>
+        </w:tabs>
+        <w:spacing w:line="360" w:lineRule="auto"/>
+        <w:rPr>
+          <w:rFonts w:ascii="Museo Sans 300" w:eastAsia="Museo Sans 300" w:hAnsi="Museo Sans 300" w:cs="Museo Sans 300"/>
+          <w:sz w:val="20"/>
+          <w:szCs w:val="20"/>
+        </w:rPr>
+      </w:pPr>
+      <w:r>
+        <w:rPr>
+          <w:rFonts w:ascii="Museo Sans 300" w:eastAsia="Museo Sans 300" w:hAnsi="Museo Sans 300" w:cs="Museo Sans 300"/>
+          <w:sz w:val="20"/>
+          <w:szCs w:val="20"/>
+        </w:rPr>
+        <w:tab/>
+      </w:r>
+      <w:r>
+        <w:rPr>
+          <w:noProof/>
+        </w:rPr>
+        <mc:AlternateContent>
+          <mc:Choice Requires="wps">
+            <w:drawing>
+              <wp:anchor distT="4294967294" distB="4294967294" distL="114300" distR="114300" simplePos="0" relativeHeight="251676672" behindDoc="0" locked="0" layoutInCell="1" hidden="0" allowOverlap="1" wp14:anchorId="71D9457B" wp14:editId="374B6A62">
+                <wp:simplePos x="0" y="0"/>
+                <wp:positionH relativeFrom="column">
+                  <wp:posOffset>1</wp:posOffset>
+                </wp:positionH>
+                <wp:positionV relativeFrom="paragraph">
+                  <wp:posOffset>278765</wp:posOffset>
+                </wp:positionV>
+                <wp:extent cx="2524125" cy="12700"/>
+                <wp:effectExtent l="0" t="0" r="0" b="0"/>
+                <wp:wrapNone/>
+                <wp:docPr id="1" name="Conector recto de flecha 1"/>
+                <wp:cNvGraphicFramePr/>
+                <a:graphic xmlns:a="http://schemas.openxmlformats.org/drawingml/2006/main">
+                  <a:graphicData uri="http://schemas.microsoft.com/office/word/2010/wordprocessingShape">
+                    <wps:wsp>
+                      <wps:cNvCnPr/>
+                      <wps:spPr>
+                        <a:xfrm>
+                          <a:off x="4083938" y="3780000"/>
+                          <a:ext cx="2524125" cy="0"/>
+                        </a:xfrm>
+                        <a:prstGeom prst="straightConnector1">
+                          <a:avLst/>
+                        </a:prstGeom>
+                        <a:noFill/>
+                        <a:ln w="9525" cap="flat" cmpd="sng">
+                          <a:solidFill>
+                            <a:schemeClr val="dk1"/>
+                          </a:solidFill>
+                          <a:prstDash val="solid"/>
+                          <a:round/>
+                          <a:headEnd type="none" w="sm" len="sm"/>
+                          <a:tailEnd type="none" w="sm" len="sm"/>
+                        </a:ln>
+                      </wps:spPr>
+                      <wps:bodyPr/>
+                    </wps:wsp>
+                  </a:graphicData>
+                </a:graphic>
+              </wp:anchor>
+            </w:drawing>
+          </mc:Choice>
+          <mc:Fallback>
+            <w:pict>
+              <v:shape w14:anchorId="5E3866FB" id="Conector recto de flecha 1" o:spid="_x0000_s1026" type="#_x0000_t32" style="position:absolute;margin-left:0;margin-top:21.95pt;width:198.75pt;height:1pt;z-index:251676672;visibility:visible;mso-wrap-style:square;mso-wrap-distance-left:9pt;mso-wrap-distance-top:-6e-5mm;mso-wrap-distance-right:9pt;mso-wrap-distance-bottom:-6e-5mm;mso-position-horizontal:absolute;mso-position-horizontal-relative:text;mso-position-vertical:absolute;mso-position-vertical-relative:text" o:gfxdata="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" strokecolor="black [3200]">
+                <v:stroke startarrowwidth="narrow" startarrowlength="short" endarrowwidth="narrow" endarrowlength="short"/>
+              </v:shape>
+            </w:pict>
+          </mc:Fallback>
+        </mc:AlternateContent>
+      </w:r>
+      <w:r>
+        <w:rPr>
+          <w:noProof/>
+        </w:rPr>
+        <mc:AlternateContent>
+          <mc:Choice Requires="wps">
+            <w:drawing>
+              <wp:anchor distT="4294967294" distB="4294967294" distL="114300" distR="114300" simplePos="0" relativeHeight="251677696" behindDoc="0" locked="0" layoutInCell="1" hidden="0" allowOverlap="1" wp14:anchorId="633CFE40" wp14:editId="35F2D67C">
+                <wp:simplePos x="0" y="0"/>
+                <wp:positionH relativeFrom="column">
+                  <wp:posOffset>3499485</wp:posOffset>
+                </wp:positionH>
+                <wp:positionV relativeFrom="paragraph">
+                  <wp:posOffset>275590</wp:posOffset>
+                </wp:positionV>
+                <wp:extent cx="2524125" cy="12700"/>
+                <wp:effectExtent l="0" t="0" r="0" b="0"/>
+                <wp:wrapNone/>
+                <wp:docPr id="4" name="Conector recto de flecha 4"/>
+                <wp:cNvGraphicFramePr/>
+                <a:graphic xmlns:a="http://schemas.openxmlformats.org/drawingml/2006/main">
+                  <a:graphicData uri="http://schemas.microsoft.com/office/word/2010/wordprocessingShape">
+                    <wps:wsp>
+                      <wps:cNvCnPr/>
+                      <wps:spPr>
+                        <a:xfrm>
+                          <a:off x="4083938" y="3780000"/>
+                          <a:ext cx="2524125" cy="0"/>
+                        </a:xfrm>
+                        <a:prstGeom prst="straightConnector1">
+                          <a:avLst/>
+                        </a:prstGeom>
+                        <a:noFill/>
+                        <a:ln w="9525" cap="flat" cmpd="sng">
+                          <a:solidFill>
+                            <a:schemeClr val="dk1"/>
+                          </a:solidFill>
+                          <a:prstDash val="solid"/>
+                          <a:round/>
+                          <a:headEnd type="none" w="sm" len="sm"/>
+                          <a:tailEnd type="none" w="sm" len="sm"/>
+                        </a:ln>
+                      </wps:spPr>
+                      <wps:bodyPr/>
+                    </wps:wsp>
+                  </a:graphicData>
+                </a:graphic>
+              </wp:anchor>
+            </w:drawing>
+          </mc:Choice>
+          <mc:Fallback>
+            <w:pict>
+              <v:shape w14:anchorId="1B6D1DCE" id="Conector recto de flecha 4" o:spid="_x0000_s1026" type="#_x0000_t32" style="position:absolute;margin-left:275.55pt;margin-top:21.7pt;width:198.75pt;height:1pt;z-index:251677696;visibility:visible;mso-wrap-style:square;mso-wrap-distance-left:9pt;mso-wrap-distance-top:-6e-5mm;mso-wrap-distance-right:9pt;mso-wrap-distance-bottom:-6e-5mm;mso-position-horizontal:absolute;mso-position-horizontal-relative:text;mso-position-vertical:absolute;mso-position-vertical-relative:text" o:gfxdata="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" strokecolor="black [3200]">
+                <v:stroke startarrowwidth="narrow" startarrowlength="short" endarrowwidth="narrow" endarrowlength="short"/>
+              </v:shape>
+            </w:pict>
+          </mc:Fallback>
+        </mc:AlternateContent>
+      </w:r>
+    </w:p>
+    <w:p>
+      <w:pPr>
+        <w:rPr>
+          <w:rFonts w:ascii="Museo Sans 300" w:eastAsia="Museo Sans 300" w:hAnsi="Museo Sans 300" w:cs="Museo Sans 300"/>
+          <w:sz w:val="20"/>
+          <w:szCs w:val="20"/>
+        </w:rPr>
+      </w:pPr>
+    </w:p>
+    <w:p>
+      <w:pPr>
+        <w:rPr>
+          <w:rFonts w:ascii="Museo Sans 300" w:eastAsia="Museo Sans 300" w:hAnsi="Museo Sans 300" w:cs="Museo Sans 300"/>
+          <w:sz w:val="20"/>
+          <w:szCs w:val="20"/>
+        </w:rPr>
+      </w:pPr>
+      <w:r>
+        <w:rPr>
+          <w:rFonts w:ascii="Museo Sans 300" w:eastAsia="Museo Sans 300" w:hAnsi="Museo Sans 300" w:cs="Museo Sans 300"/>
+          <w:sz w:val="20"/>
+          <w:szCs w:val="20"/>
+        </w:rPr>
+        <w:t xml:space="preserve">Nombre, firma, fecha y sello de representante </w:t>
+      </w:r>
+      <w:r>
+        <w:rPr>
+          <w:rFonts w:ascii="Museo Sans 300" w:eastAsia="Museo Sans 300" w:hAnsi="Museo Sans 300" w:cs="Museo Sans 300"/>
+          <w:sz w:val="20"/>
+          <w:szCs w:val="20"/>
+        </w:rPr>
+        <w:tab/>
+      </w:r>
+      <w:r>
+        <w:rPr>
+          <w:rFonts w:ascii="Museo Sans 300" w:eastAsia="Museo Sans 300" w:hAnsi="Museo Sans 300" w:cs="Museo Sans 300"/>
+          <w:sz w:val="20"/>
+          <w:szCs w:val="20"/>
+        </w:rPr>
+        <w:tab/>
+        <w:t xml:space="preserve">             Nombre, firma, fecha y sello de representante </w:t>
+      </w:r>
+    </w:p>
+    <w:p>
+      <w:pPr>
+        <w:rPr>
+          <w:rFonts w:ascii="Museo Sans 300" w:eastAsia="Museo Sans 300" w:hAnsi="Museo Sans 300" w:cs="Museo Sans 300"/>
+          <w:sz w:val="20"/>
+          <w:szCs w:val="20"/>
+        </w:rPr>
+      </w:pPr>
+      <w:r>
+        <w:rPr>
+          <w:rFonts w:ascii="Museo Sans 300" w:eastAsia="Museo Sans 300" w:hAnsi="Museo Sans 300" w:cs="Museo Sans 300"/>
+          <w:sz w:val="20"/>
+          <w:szCs w:val="20"/>
+        </w:rPr>
+        <w:t>de ubicación</w:t>
+      </w:r>
+      <w:r>
+        <w:rPr>
+          <w:rFonts w:ascii="Museo Sans 300" w:eastAsia="Museo Sans 300" w:hAnsi="Museo Sans 300" w:cs="Museo Sans 300"/>
+          <w:sz w:val="20"/>
+          <w:szCs w:val="20"/>
+        </w:rPr>
+        <w:tab/>
+      </w:r>
+      <w:r>
+        <w:rPr>
+          <w:rFonts w:ascii="Museo Sans 300" w:eastAsia="Museo Sans 300" w:hAnsi="Museo Sans 300" w:cs="Museo Sans 300"/>
+          <w:sz w:val="20"/>
+          <w:szCs w:val="20"/>
+        </w:rPr>
+        <w:tab/>
+      </w:r>
+      <w:r>
+        <w:rPr>
+          <w:rFonts w:ascii="Museo Sans 300" w:eastAsia="Museo Sans 300" w:hAnsi="Museo Sans 300" w:cs="Museo Sans 300"/>
+          <w:sz w:val="20"/>
+          <w:szCs w:val="20"/>
+        </w:rPr>
+        <w:tab/>
+      </w:r>
+      <w:r>
+        <w:rPr>
+          <w:rFonts w:ascii="Museo Sans 300" w:eastAsia="Museo Sans 300" w:hAnsi="Museo Sans 300" w:cs="Museo Sans 300"/>
+          <w:sz w:val="20"/>
+          <w:szCs w:val="20"/>
+        </w:rPr>
+        <w:tab/>
+      </w:r>
+      <w:r>
+        <w:rPr>
+          <w:rFonts w:ascii="Museo Sans 300" w:eastAsia="Museo Sans 300" w:hAnsi="Museo Sans 300" w:cs="Museo Sans 300"/>
+          <w:sz w:val="20"/>
+          <w:szCs w:val="20"/>
+        </w:rPr>
+        <w:tab/>
+      </w:r>
+      <w:r>
+        <w:rPr>
+          <w:rFonts w:ascii="Museo Sans 300" w:eastAsia="Museo Sans 300" w:hAnsi="Museo Sans 300" w:cs="Museo Sans 300"/>
+          <w:sz w:val="20"/>
+          <w:szCs w:val="20"/>
+        </w:rPr>
+        <w:tab/>
+        <w:t xml:space="preserve">            de ubicación</w:t>
+      </w:r>
+    </w:p>
+    <w:p>
+      <w:pPr>
+        <w:spacing w:line="360" w:lineRule="auto"/>
+        <w:rPr>
+          <w:rFonts w:ascii="Museo Sans 300" w:eastAsia="Museo Sans 300" w:hAnsi="Museo Sans 300" w:cs="Museo Sans 300"/>
+          <w:sz w:val="20"/>
+          <w:szCs w:val="20"/>
+        </w:rPr>
+      </w:pPr>
+    </w:p>
+    <w:p>
+      <w:pPr>
+        <w:pStyle w:val="Standard"/>
+        <w:tabs>
+          <w:tab w:val="left" w:pos="3375"/>
+          <w:tab w:val="left" w:pos="3525"/>
+        </w:tabs>
+      </w:pPr>
+    </w:p>
+    <w:p>
+      <w:pPr>
+        <w:pStyle w:val="Standard"/>
+        <w:tabs>
+          <w:tab w:val="left" w:pos="3375"/>
+          <w:tab w:val="left" w:pos="3525"/>
+        </w:tabs>
+        <w:spacing w:line="360" w:lineRule="auto"/>
+        <w:jc w:val="center"/>
+        <w:rPr>
+          <w:sz w:val="22"/>
+          <w:szCs w:val="22"/>
+        </w:rPr>
+      </w:pPr>
     </w:p>
     <w:sectPr>
       <w:type w:val="continuous"/>

</xml_diff>